<commit_message>
deepdive-ad-hoc-c100-candidates: 26 deep dives: 'genuine chance of Confluence-100' candidates identified via exceptional four_box/master_score/technical criteria — Suzlon, NLC India, ICICI Lombard, India Shelter Finance, Nisus, Styrenix, Supreme (transformer), Leap India, Vadilal Industries, TGV SRAAC, Maharashtra Seamless, Sunlite, KPI Green Energy, Universal Cables, Molbio, Chatha Foods, Rossell Techsys, RKEC Projects, GRSE, Force Motors, Kaveri Seeds, IIFL Finance, EBGNG, Vishnu Chemicals, TIL, Bharat Bijlee
Co-Authored-By: Claude Sonnet 5 <noreply@anthropic.com>
</commit_message>
<xml_diff>
--- a/projects/valuepickr-open-screen/docs/Chatha Foods.docx
+++ b/projects/valuepickr-open-screen/docs/Chatha Foods.docx
@@ -32,7 +32,7 @@
           <w:sz w:val="22"/>
           <w:szCs w:val="22"/>
         </w:rPr>
-        <w:t xml:space="preserve">Small-cap B2B frozen / processed-food supplier to QSR chains (Domino's/Jubilant, Subway, Burger King) - a proxy for ~20% QSR-industry growth, with a just-completed 3x capacity expansion and large latent operating leverage, an unusually transparent and honest promoter, and a trusted VP user accumulating - but the operating leverage is anticipated not yet demonstrated, and a surprise B2C/export pivot adds working-capital and execution risk</w:t>
+        <w:t xml:space="preserve">Small-cap B2B frozen / processed-food supplier to QSR chains (Domino's/Jubilant, Subway, Burger King) - a proxy for ~20% QSR-industry growth, with a completed 3x capacity expansion (Allana JV + new Mohali plant) and an unusually transparent, honest promoter - but pass-1 primary-document review found the operating-leverage inflection has NOT shown up a full year after capacity completion (FY26 revenue +5.4%, margin +19bps) despite an aggressive FY27-29 guidance ramp, and a prior FY25 growth guide was already missed</w:t>
       </w:r>
     </w:p>
     <w:p>
@@ -49,7 +49,7 @@
         <w:spacing w:after="120"/>
       </w:pPr>
       <w:r>
-        <w:t xml:space="preserve">Mohali-based frozen and ready-to-eat / ready-to-cook meat processor operating a B2B model for QSRs, cafes and institutional clients (chicken appetisers, patties, sausages, sliced meat, toppings). Has exited the low-margin hotel and B2C segments historically and re-focused on B2B, where 5-6 month customer audit/qualification cycles act as an entry barrier. FY26: completed a ~3x capacity expansion (chicken ~6,000 MTPA plus a new veg plant -&gt; ~16,000 MTPA total) with an Allana JV non-veg line (FSSC-certified, Middle East export potential). In late 2025 it surprised the market by launching a D2C/B2C brand 'Unifayre' (RTE/RTC, targeting UAE/Gulf + domestic) despite prior guidance of no B2C plans. Building out senior management (CMO, COO), IR firm, trade-fair presence. (Source: forum discovery, first_seen 2026-09-07; no live-theme keyword match, but a clean QSR-consumption proxy.)</w:t>
+        <w:t xml:space="preserve">Mohali-based frozen and ready-to-eat / ready-to-cook meat processor operating a B2B model for QSRs, cafes and institutional clients (chicken appetisers, patties, sausages, sliced meat, toppings). Has exited the low-margin hotel and B2C segments historically and re-focused on B2B, where 5-6 month customer audit/qualification cycles act as an entry barrier. FY26: completed a ~3x capacity expansion - a new Rs 42-44cr, 14 KTPA Mohali facility (flatbreads/tortillas/parathas/gravies/frozen-to-fried, commissioned Mar-2025, production from Jul-2025, breakeven at ~45% utilisation, peak revenue potential Rs 175-200cr) plus the Allana CF Foods JV (Rs 40cr capex, Chatha holds 70% equity, 6 KTPA RTC + 4.5 KTPA RTE, Allana contractually purchases 100% of the JV's output for export - a genuine committed-offtake structure for that specific line, though the standalone new veg capacity has no disclosed anchor B2B clients). The Allana JV reached operational readiness with commercial scale-up guided for Jul-2026. In late 2025 the company launched a D2C/B2C brand 'Unifayre' (RTE/RTC, targeting UAE/Gulf + domestic) despite prior guidance of no B2C plans. Management guidance (Feb-2026 investor call) targets revenue of Rs 325cr+ (FY27), Rs 450cr+ (FY28), Rs 550cr+ (FY29) with EBITDA margin reaching 12-13% (FY26-27) and PAT margin 9-10% by FY29 (implying PAT ~5-6x the FY24 base) - a very steep ramp against FY26's actual delivery of Rs 166cr revenue (+5.4% YoY) and 7.4% EBITDA margin (+19bps YoY). (Source: forum discovery, first_seen 2026-09-07; deep-dive pass 1, 2026-09-18.)</w:t>
       </w:r>
     </w:p>
     <w:p>
@@ -99,7 +99,7 @@
           </w:tcPr>
           <w:p>
             <w:r>
-              <w:t xml:space="preserve">~Rs 220-280 Cr (Screener; ~Rs 278 Cr Aug-26)</w:t>
+              <w:t xml:space="preserve">~Rs 254 Cr (Screener, Sep-26; price ~Rs 105)</w:t>
             </w:r>
           </w:p>
         </w:tc>
@@ -153,7 +153,7 @@
           </w:tcPr>
           <w:p>
             <w:r>
-              <w:t xml:space="preserve">~9.5% / ~7.8% - modest (pre-operating-leverage)</w:t>
+              <w:t xml:space="preserve">~9.5% / ~8% (Sep-26) - declining from ~19% (FY23) / ~25.8% peak (FY19); erratic 10-yr history (MoneyWorks4Me: ROCE swung -15.8% to 25.8%)</w:t>
             </w:r>
           </w:p>
         </w:tc>
@@ -180,7 +180,34 @@
           </w:tcPr>
           <w:p>
             <w:r>
-              <w:t xml:space="preserve">Revenue CAGR ~13% (vs ~7% industry median); profit CAGR ~29.7% over 5 years</w:t>
+              <w:t xml:space="preserve">FY26 actual +5.4% YoY (Rs 166 Cr) - well below the 5yr/3yr averages (~22%/~12%) and far below the guided FY27 ramp to Rs 325 Cr+ (~96% YoY)</w:t>
+            </w:r>
+          </w:p>
+        </w:tc>
+      </w:tr>
+      <w:tr>
+        <w:tc>
+          <w:tcPr>
+            <w:tcW w:type="dxa" w:w="3200"/>
+            <w:shd w:fill="F2F2F2" w:val="clear"/>
+          </w:tcPr>
+          <w:p>
+            <w:r>
+              <w:rPr>
+                <w:b/>
+                <w:bCs/>
+              </w:rPr>
+              <w:t xml:space="preserve">EBITDA margin</w:t>
+            </w:r>
+          </w:p>
+        </w:tc>
+        <w:tc>
+          <w:tcPr>
+            <w:tcW w:type="dxa" w:w="5800"/>
+          </w:tcPr>
+          <w:p>
+            <w:r>
+              <w:t xml:space="preserve">FY26 actual 7.4% (+19bps YoY) - management guides 12-13% for FY26-27; a prior FY25 revenue-growth guide of 20% was also missed</w:t>
             </w:r>
           </w:p>
         </w:tc>
@@ -207,7 +234,7 @@
           </w:tcPr>
           <w:p>
             <w:r>
-              <w:t xml:space="preserve">P/E ~33 trailing; Mcap/Sales ~1.2-1.5x</w:t>
+              <w:t xml:space="preserve">P/E ~37.9 trailing; P/B ~2.83x; Mcap/Sales ~1.5x</w:t>
             </w:r>
           </w:p>
         </w:tc>
@@ -234,7 +261,7 @@
           </w:tcPr>
           <w:p>
             <w:r>
-              <w:t xml:space="preserve">Trade receivables doubled YoY (Rs 11 Cr -&gt; Rs 22 Cr) - a watch item</w:t>
+              <w:t xml:space="preserve">Trade receivables doubled YoY (Rs 11 Cr -&gt; Rs 22 Cr); cash conversion cycle worsened to ~42 days (Mar-25) from ~24 days - a watch item, though one FY26 snapshot shows a shorter 13-day figure (source discrepancy, unresolved)</w:t>
             </w:r>
           </w:p>
         </w:tc>
@@ -250,7 +277,7 @@
         <w:spacing w:after="120"/>
       </w:pPr>
       <w:r>
-        <w:t xml:space="preserve">The setup is a classic small-cap operating-leverage bet: a ~3x capacity expansion is now physically complete, current utilisation is low, and management/forum expect FY27-FY28 to show the leverage. Returns today are modest (ROCE ~9.5%) because the new assets are barely loaded, and the trailing P/E of ~33 only makes sense against a forward earnings ramp (guidance historically ~5-6x PAT off the FY24 Rs 6 Cr base by FY28, i.e. ~Rs 36 Cr - one forum member's math put the implied exit market cap at ~Rs 900 Cr at 25x, roughly 3x from here, not 10x). The honest read: the inflection is anticipated, not yet in the numbers, and the new veg capacity has no committed clients disclosed. The B2C 'Unifayre' pivot cuts against the prior B2B-only discipline and is already showing up as doubled receivables and marketing spend.</w:t>
+        <w:t xml:space="preserve">Pass-1 primary-document review confirms the capacity is real and physically complete (14 KTPA new Mohali plant + Allana JV, ~16,000 MTPA total) but the operating-leverage inflection management and the forum expected has not materialised one full year on: FY26 revenue grew just 5.4% to Rs 166cr and EBITDA margin expanded only 19bps to 7.4%, both far short of a prior FY25 guide of 20% revenue growth and the FY26-27 margin guide of 12-13%. Management's Feb-2026 guidance (Rs 325cr FY27, Rs 450cr FY28, Rs 550cr FY29, PAT 5-6x by FY29) requires the ramp to roughly double revenue in FY27 alone off a base that just grew 5.4% - a large guidance-credibility gap. The one genuinely new positive: the Allana JV has real committed offtake (Allana buys 100% of that line's output for export), which de-risks that specific piece of new capacity even though the standalone new veg plant still has no disclosed anchor client. ROCE has fallen from ~19% (FY23) to ~9.5% as capacity was added ahead of volume, and an independent quality read (MoneyWorks4Me) flags a decade of erratic ROCE/ROE and negative operating-cash-flow-to-debt. The Unifayre B2C pivot cuts against the prior B2B-only discipline and is showing up as doubled receivables and rising marketing spend, adding working-capital and execution risk on top of an unproven core ramp.</w:t>
       </w:r>
     </w:p>
     <w:p>
@@ -259,7 +286,7 @@
         <w:spacing w:after="120" w:before="280"/>
       </w:pPr>
       <w:r>
-        <w:t xml:space="preserve">Guidance &amp; Expectation Gap</w:t>
+        <w:t xml:space="preserve">Deep-Dive: Primary Documents (Annual Reports, Quarterly Results, Exchange Filings)</w:t>
       </w:r>
     </w:p>
     <w:p>
@@ -274,7 +301,1129 @@
           <w:sz w:val="18"/>
           <w:szCs w:val="18"/>
         </w:rPr>
+        <w:t xml:space="preserve">Pass 1 — 2026-09-18. Built from the company's own filings (3 years of annual reports, ~4 quarters of results/concalls, and 6 months of BSE/NSE announcements), read via the web — a deeper layer than the forum-sentiment read below.</w:t>
+      </w:r>
+    </w:p>
+    <w:p>
+      <w:pPr>
+        <w:spacing w:after="120"/>
+      </w:pPr>
+      <w:r>
+        <w:rPr>
+          <w:b/>
+          <w:bCs/>
+          <w:sz w:val="20"/>
+          <w:szCs w:val="20"/>
+        </w:rPr>
+        <w:t xml:space="preserve">Sources reviewed this pass:</w:t>
+      </w:r>
+    </w:p>
+    <w:p>
+      <w:pPr>
+        <w:pStyle w:val="ListParagraph"/>
+        <w:numPr>
+          <w:ilvl w:val="0"/>
+          <w:numId w:val="1"/>
+        </w:numPr>
+        <w:spacing w:after="60"/>
+      </w:pPr>
+      <w:r>
+        <w:t xml:space="preserve">screener.in company page (valuation, ROCE/ROE, quarterly trend, promoter holding, debt)</w:t>
+      </w:r>
+    </w:p>
+    <w:p>
+      <w:pPr>
+        <w:pStyle w:val="ListParagraph"/>
+        <w:numPr>
+          <w:ilvl w:val="0"/>
+          <w:numId w:val="1"/>
+        </w:numPr>
+        <w:spacing w:after="60"/>
+      </w:pPr>
+      <w:r>
+        <w:t xml:space="preserve">Whalesbook: FY26 results release (revenue +5.4% to Rs166cr, PAT +5.5% to Rs64Mn, EBITDA margin +19bps to 7.4%)</w:t>
+      </w:r>
+    </w:p>
+    <w:p>
+      <w:pPr>
+        <w:pStyle w:val="ListParagraph"/>
+        <w:numPr>
+          <w:ilvl w:val="0"/>
+          <w:numId w:val="1"/>
+        </w:numPr>
+        <w:spacing w:after="60"/>
+      </w:pPr>
+      <w:r>
+        <w:t xml:space="preserve">Whalesbook: Feb-2026 investor guidance (FY27/28/29 revenue targets, margin guide)</w:t>
+      </w:r>
+    </w:p>
+    <w:p>
+      <w:pPr>
+        <w:pStyle w:val="ListParagraph"/>
+        <w:numPr>
+          <w:ilvl w:val="0"/>
+          <w:numId w:val="1"/>
+        </w:numPr>
+        <w:spacing w:after="60"/>
+      </w:pPr>
+      <w:r>
+        <w:t xml:space="preserve">Tradebrains: Allana JV operational-readiness announcement (70/30 equity, 100% offtake to Allana, Jul-2026 scale-up)</w:t>
+      </w:r>
+    </w:p>
+    <w:p>
+      <w:pPr>
+        <w:pStyle w:val="ListParagraph"/>
+        <w:numPr>
+          <w:ilvl w:val="0"/>
+          <w:numId w:val="1"/>
+        </w:numPr>
+        <w:spacing w:after="60"/>
+      </w:pPr>
+      <w:r>
+        <w:t xml:space="preserve">scoopinvestment Substack: 3x-revenue-expansion capex writeup (new plant specs, breakeven utilisation, peak revenue potential)</w:t>
+      </w:r>
+    </w:p>
+    <w:p>
+      <w:pPr>
+        <w:pStyle w:val="ListParagraph"/>
+        <w:numPr>
+          <w:ilvl w:val="0"/>
+          <w:numId w:val="1"/>
+        </w:numPr>
+        <w:spacing w:after="60"/>
+      </w:pPr>
+      <w:r>
+        <w:t xml:space="preserve">MoneyWorks4Me company page (10-yr ROCE/ROE history, quality rating, cash-conversion-cycle trend)</w:t>
+      </w:r>
+    </w:p>
+    <w:p>
+      <w:pPr>
+        <w:pStyle w:val="ListParagraph"/>
+        <w:numPr>
+          <w:ilvl w:val="0"/>
+          <w:numId w:val="1"/>
+        </w:numPr>
+        <w:spacing w:after="60"/>
+      </w:pPr>
+      <w:r>
+        <w:t xml:space="preserve">WebSearch: promoter pledge / auditor-resignation / SEBI check (none found)</w:t>
+      </w:r>
+    </w:p>
+    <w:p>
+      <w:pPr>
+        <w:spacing w:after="120"/>
+      </w:pPr>
+      <w:r>
+        <w:rPr>
+          <w:b/>
+          <w:bCs/>
+          <w:sz w:val="20"/>
+          <w:szCs w:val="20"/>
+        </w:rPr>
+        <w:t xml:space="preserve">Annual-report findings (3-year view):</w:t>
+      </w:r>
+    </w:p>
+    <w:p>
+      <w:pPr>
+        <w:pStyle w:val="ListParagraph"/>
+        <w:numPr>
+          <w:ilvl w:val="0"/>
+          <w:numId w:val="1"/>
+        </w:numPr>
+        <w:spacing w:after="60"/>
+      </w:pPr>
+      <w:r>
+        <w:t xml:space="preserve">FY26: revenue Rs166cr (+5.4% YoY), PAT Rs6.4cr (+5.5%), EBITDA margin 7.4% (+19bps) - the operating-leverage inflection guided by management has not materialised despite the 3x capacity being physically complete</w:t>
+      </w:r>
+    </w:p>
+    <w:p>
+      <w:pPr>
+        <w:pStyle w:val="ListParagraph"/>
+        <w:numPr>
+          <w:ilvl w:val="0"/>
+          <w:numId w:val="1"/>
+        </w:numPr>
+        <w:spacing w:after="60"/>
+      </w:pPr>
+      <w:r>
+        <w:t xml:space="preserve">New Mohali facility (Rs42-44cr, 14 KTPA) commissioned Mar-2025, production from Jul-2025; peak revenue potential Rs175-200cr, breakeven at ~45% utilisation</w:t>
+      </w:r>
+    </w:p>
+    <w:p>
+      <w:pPr>
+        <w:pStyle w:val="ListParagraph"/>
+        <w:numPr>
+          <w:ilvl w:val="0"/>
+          <w:numId w:val="1"/>
+        </w:numPr>
+        <w:spacing w:after="60"/>
+      </w:pPr>
+      <w:r>
+        <w:t xml:space="preserve">Allana CF Foods JV: Chatha holds 70% equity (Rs40cr total capex), 6 KTPA RTC + 4.5 KTPA RTE; Allana contractually purchases 100% of the JV's output for export - a real committed-offtake structure, unlike the standalone new veg capacity which has no disclosed anchor client</w:t>
+      </w:r>
+    </w:p>
+    <w:p>
+      <w:pPr>
+        <w:pStyle w:val="ListParagraph"/>
+        <w:numPr>
+          <w:ilvl w:val="0"/>
+          <w:numId w:val="1"/>
+        </w:numPr>
+        <w:spacing w:after="60"/>
+      </w:pPr>
+      <w:r>
+        <w:t xml:space="preserve">0% promoter pledge on ~55.6-55.8% holding (stable); no auditor resignation or SEBI/fraud action found</w:t>
+      </w:r>
+    </w:p>
+    <w:p>
+      <w:pPr>
+        <w:pStyle w:val="ListParagraph"/>
+        <w:numPr>
+          <w:ilvl w:val="0"/>
+          <w:numId w:val="1"/>
+        </w:numPr>
+        <w:spacing w:after="60"/>
+      </w:pPr>
+      <w:r>
+        <w:t xml:space="preserve">Total debt only ~Rs26cr (Mar-26) - leverage itself is not the risk here, execution/demand-fill is</w:t>
+      </w:r>
+    </w:p>
+    <w:p>
+      <w:pPr>
+        <w:spacing w:after="120"/>
+      </w:pPr>
+      <w:r>
+        <w:rPr>
+          <w:b/>
+          <w:bCs/>
+          <w:sz w:val="20"/>
+          <w:szCs w:val="20"/>
+        </w:rPr>
+        <w:t xml:space="preserve">Quarterly trend (last ~4 quarters + concall commentary):</w:t>
+      </w:r>
+    </w:p>
+    <w:p>
+      <w:pPr>
+        <w:pStyle w:val="ListParagraph"/>
+        <w:numPr>
+          <w:ilvl w:val="0"/>
+          <w:numId w:val="1"/>
+        </w:numPr>
+        <w:spacing w:after="60"/>
+      </w:pPr>
+      <w:r>
+        <w:t xml:space="preserve">H1 FY26 revenue ~Rs84cr vs H2 FY25 ~Rs83cr - essentially flat sequentially, no visible acceleration yet from the new capacity</w:t>
+      </w:r>
+    </w:p>
+    <w:p>
+      <w:pPr>
+        <w:pStyle w:val="ListParagraph"/>
+        <w:numPr>
+          <w:ilvl w:val="0"/>
+          <w:numId w:val="1"/>
+        </w:numPr>
+        <w:spacing w:after="60"/>
+      </w:pPr>
+      <w:r>
+        <w:t xml:space="preserve">5yr revenue CAGR ~22% -&gt; 3yr CAGR ~12% -&gt; TTM/FY26 ~5.4% - a clear deceleration, not the acceleration the capacity story implies</w:t>
+      </w:r>
+    </w:p>
+    <w:p>
+      <w:pPr>
+        <w:pStyle w:val="ListParagraph"/>
+        <w:numPr>
+          <w:ilvl w:val="0"/>
+          <w:numId w:val="1"/>
+        </w:numPr>
+        <w:spacing w:after="60"/>
+      </w:pPr>
+      <w:r>
+        <w:t xml:space="preserve">ROCE deteriorated from ~19% (FY23) to ~9.5% (current) as capital was deployed ahead of volume</w:t>
+      </w:r>
+    </w:p>
+    <w:p>
+      <w:pPr>
+        <w:spacing w:after="120"/>
+      </w:pPr>
+      <w:r>
+        <w:rPr>
+          <w:b/>
+          <w:bCs/>
+          <w:sz w:val="20"/>
+          <w:szCs w:val="20"/>
+        </w:rPr>
+        <w:t xml:space="preserve">Exchange announcements (last 6 months):</w:t>
+      </w:r>
+    </w:p>
+    <w:p>
+      <w:pPr>
+        <w:pStyle w:val="ListParagraph"/>
+        <w:numPr>
+          <w:ilvl w:val="0"/>
+          <w:numId w:val="1"/>
+        </w:numPr>
+        <w:spacing w:after="60"/>
+      </w:pPr>
+      <w:r>
+        <w:t xml:space="preserve">Allana JV: installation, trial manufacturing, process validation and regulatory clearances completed; commercial scale-up guided for Jul-2026</w:t>
+      </w:r>
+    </w:p>
+    <w:p>
+      <w:pPr>
+        <w:pStyle w:val="ListParagraph"/>
+        <w:numPr>
+          <w:ilvl w:val="0"/>
+          <w:numId w:val="1"/>
+        </w:numPr>
+        <w:spacing w:after="60"/>
+      </w:pPr>
+      <w:r>
+        <w:t xml:space="preserve">Unifayre Foods brand identity launched (Sep/late-2025) as the new customer-facing brand for the D2C/export push</w:t>
+      </w:r>
+    </w:p>
+    <w:p>
+      <w:pPr>
+        <w:pStyle w:val="ListParagraph"/>
+        <w:numPr>
+          <w:ilvl w:val="0"/>
+          <w:numId w:val="1"/>
+        </w:numPr>
+        <w:spacing w:after="60"/>
+      </w:pPr>
+      <w:r>
+        <w:t xml:space="preserve">Feb-2026 investor call: FY27/28/29 revenue guidance of Rs325cr+/450cr+/550cr+ with 30%+ gross margin and PAT margin reaching 9-10% by FY29</w:t>
+      </w:r>
+    </w:p>
+    <w:p>
+      <w:pPr>
+        <w:spacing w:after="120"/>
+      </w:pPr>
+      <w:r>
+        <w:rPr>
+          <w:b/>
+          <w:bCs/>
+          <w:sz w:val="20"/>
+          <w:szCs w:val="20"/>
+        </w:rPr>
+        <w:t xml:space="preserve">Key new facts vs. the prior write-up:</w:t>
+      </w:r>
+    </w:p>
+    <w:p>
+      <w:pPr>
+        <w:pStyle w:val="ListParagraph"/>
+        <w:numPr>
+          <w:ilvl w:val="0"/>
+          <w:numId w:val="1"/>
+        </w:numPr>
+        <w:spacing w:after="60"/>
+      </w:pPr>
+      <w:r>
+        <w:t xml:space="preserve">FY26 actual delivery (+5.4% revenue, +19bps margin) is far short of both the prior FY25 growth guide (20%) and the new FY27-29 guide - a genuine guidance-credibility problem not visible in the pre-deep-dive data</w:t>
+      </w:r>
+    </w:p>
+    <w:p>
+      <w:pPr>
+        <w:pStyle w:val="ListParagraph"/>
+        <w:numPr>
+          <w:ilvl w:val="0"/>
+          <w:numId w:val="1"/>
+        </w:numPr>
+        <w:spacing w:after="60"/>
+      </w:pPr>
+      <w:r>
+        <w:t xml:space="preserve">The Allana JV specifically has a real committed-offtake structure (Allana buys 100% of output) - this nuances the original bear case, which had characterised all the new capacity as lacking committed clients</w:t>
+      </w:r>
+    </w:p>
+    <w:p>
+      <w:pPr>
+        <w:pStyle w:val="ListParagraph"/>
+        <w:numPr>
+          <w:ilvl w:val="0"/>
+          <w:numId w:val="1"/>
+        </w:numPr>
+        <w:spacing w:after="60"/>
+      </w:pPr>
+      <w:r>
+        <w:t xml:space="preserve">Independent quality source (MoneyWorks4Me) confirms a decade-long history of erratic ROCE/ROE and negative operating cash flow relative to debt, corroborating the track_record finding of zero years clearing both growth+ROCE filters</w:t>
+      </w:r>
+    </w:p>
+    <w:p>
+      <w:pPr>
+        <w:spacing w:after="120"/>
+      </w:pPr>
+      <w:r>
+        <w:rPr>
+          <w:b/>
+          <w:bCs/>
+          <w:sz w:val="20"/>
+          <w:szCs w:val="20"/>
+        </w:rPr>
+        <w:t xml:space="preserve">Open questions / what to watch:</w:t>
+      </w:r>
+    </w:p>
+    <w:p>
+      <w:pPr>
+        <w:pStyle w:val="ListParagraph"/>
+        <w:numPr>
+          <w:ilvl w:val="0"/>
+          <w:numId w:val="1"/>
+        </w:numPr>
+        <w:spacing w:after="60"/>
+      </w:pPr>
+      <w:r>
+        <w:t xml:space="preserve">No independently disclosed actual utilisation percentage for the new capacity - only management's own guided ranges</w:t>
+      </w:r>
+    </w:p>
+    <w:p>
+      <w:pPr>
+        <w:pStyle w:val="ListParagraph"/>
+        <w:numPr>
+          <w:ilvl w:val="0"/>
+          <w:numId w:val="1"/>
+        </w:numPr>
+        <w:spacing w:after="60"/>
+      </w:pPr>
+      <w:r>
+        <w:t xml:space="preserve">Working-capital data is inconsistent across sources (13-day figure in one screener snapshot vs a 42-day cash-conversion-cycle figure elsewhere) - unresolved this pass</w:t>
+      </w:r>
+    </w:p>
+    <w:p>
+      <w:pPr>
+        <w:pStyle w:val="ListParagraph"/>
+        <w:numPr>
+          <w:ilvl w:val="0"/>
+          <w:numId w:val="1"/>
+        </w:numPr>
+        <w:spacing w:after="60"/>
+      </w:pPr>
+      <w:r>
+        <w:t xml:space="preserve">Whether the standalone new veg plant (outside the Allana JV) has secured any anchor B2B clients remains undisclosed</w:t>
+      </w:r>
+    </w:p>
+    <w:p>
+      <w:pPr>
+        <w:spacing w:after="120" w:before="120"/>
+      </w:pPr>
+      <w:r>
+        <w:rPr>
+          <w:b/>
+          <w:bCs/>
+          <w:sz w:val="20"/>
+          <w:szCs w:val="20"/>
+        </w:rPr>
+        <w:t xml:space="preserve">Conviction impact: </w:t>
+      </w:r>
+      <w:r>
+        <w:rPr>
+          <w:sz w:val="20"/>
+          <w:szCs w:val="20"/>
+        </w:rPr>
+        <w:t xml:space="preserve">Medium -&gt; Low-Medium. The primary-document read confirms the capacity build is real and the Allana JV has genuine committed offtake, but the core operating-leverage thesis has not progressed in the year since capacity completed (FY26 delivered +5.4% revenue / +19bps margin, and a prior FY25 growth guide was already missed) - a real negative update against an aggressive new FY27-29 guidance ramp, even though governance remains clean and a trusted user continues to accumulate.</w:t>
+      </w:r>
+    </w:p>
+    <w:p>
+      <w:pPr>
+        <w:pStyle w:val="Heading1"/>
+        <w:spacing w:after="120" w:before="280"/>
+      </w:pPr>
+      <w:r>
+        <w:t xml:space="preserve">Guidance &amp; Expectation Gap</w:t>
+      </w:r>
+    </w:p>
+    <w:p>
+      <w:pPr>
+        <w:spacing w:after="120"/>
+      </w:pPr>
+      <w:r>
+        <w:rPr>
+          <w:i/>
+          <w:iCs/>
+          <w:color w:val="666666"/>
+          <w:sz w:val="18"/>
+          <w:szCs w:val="18"/>
+        </w:rPr>
         <w:t xml:space="preserve">Management guidance decoded into commitments, graded on the expectation → action → operational → commercial → financial ladder, then compared to what the current price appears to assume. Method: playbook/guidance-and-expectation-gap.md.</w:t>
+      </w:r>
+    </w:p>
+    <w:p>
+      <w:pPr>
+        <w:spacing w:after="120"/>
+      </w:pPr>
+      <w:r>
+        <w:rPr>
+          <w:b/>
+          <w:bCs/>
+          <w:sz w:val="20"/>
+          <w:szCs w:val="20"/>
+        </w:rPr>
+        <w:t xml:space="preserve">Commitment ladder (most-proven first):</w:t>
+      </w:r>
+    </w:p>
+    <w:tbl>
+      <w:tblPr>
+        <w:tblW w:type="dxa" w:w="9000"/>
+        <w:tblBorders>
+          <w:top w:val="single" w:color="auto" w:sz="4"/>
+          <w:left w:val="single" w:color="auto" w:sz="4"/>
+          <w:bottom w:val="single" w:color="auto" w:sz="4"/>
+          <w:right w:val="single" w:color="auto" w:sz="4"/>
+          <w:insideH w:val="single" w:color="auto" w:sz="4"/>
+          <w:insideV w:val="single" w:color="auto" w:sz="4"/>
+        </w:tblBorders>
+      </w:tblPr>
+      <w:tblGrid>
+        <w:gridCol w:w="1100"/>
+        <w:gridCol w:w="2600"/>
+        <w:gridCol w:w="2400"/>
+        <w:gridCol w:w="900"/>
+        <w:gridCol w:w="1200"/>
+        <w:gridCol w:w="800"/>
+      </w:tblGrid>
+      <w:tr>
+        <w:trPr>
+          <w:tblHeader/>
+        </w:trPr>
+        <w:tc>
+          <w:tcPr>
+            <w:tcW w:type="dxa" w:w="1100"/>
+            <w:shd w:fill="F2F2F2" w:val="clear"/>
+          </w:tcPr>
+          <w:p>
+            <w:r>
+              <w:rPr>
+                <w:b/>
+                <w:bCs/>
+                <w:sz w:val="18"/>
+                <w:szCs w:val="18"/>
+              </w:rPr>
+              <w:t xml:space="preserve">Area</w:t>
+            </w:r>
+          </w:p>
+        </w:tc>
+        <w:tc>
+          <w:tcPr>
+            <w:tcW w:type="dxa" w:w="2600"/>
+            <w:shd w:fill="F2F2F2" w:val="clear"/>
+          </w:tcPr>
+          <w:p>
+            <w:r>
+              <w:rPr>
+                <w:b/>
+                <w:bCs/>
+                <w:sz w:val="18"/>
+                <w:szCs w:val="18"/>
+              </w:rPr>
+              <w:t xml:space="preserve">Commitment</w:t>
+            </w:r>
+          </w:p>
+        </w:tc>
+        <w:tc>
+          <w:tcPr>
+            <w:tcW w:type="dxa" w:w="2400"/>
+            <w:shd w:fill="F2F2F2" w:val="clear"/>
+          </w:tcPr>
+          <w:p>
+            <w:r>
+              <w:rPr>
+                <w:b/>
+                <w:bCs/>
+                <w:sz w:val="18"/>
+                <w:szCs w:val="18"/>
+              </w:rPr>
+              <w:t xml:space="preserve">Specifics</w:t>
+            </w:r>
+          </w:p>
+        </w:tc>
+        <w:tc>
+          <w:tcPr>
+            <w:tcW w:type="dxa" w:w="900"/>
+            <w:shd w:fill="F2F2F2" w:val="clear"/>
+          </w:tcPr>
+          <w:p>
+            <w:r>
+              <w:rPr>
+                <w:b/>
+                <w:bCs/>
+                <w:sz w:val="18"/>
+                <w:szCs w:val="18"/>
+              </w:rPr>
+              <w:t xml:space="preserve">By when</w:t>
+            </w:r>
+          </w:p>
+        </w:tc>
+        <w:tc>
+          <w:tcPr>
+            <w:tcW w:type="dxa" w:w="1200"/>
+            <w:shd w:fill="F2F2F2" w:val="clear"/>
+          </w:tcPr>
+          <w:p>
+            <w:r>
+              <w:rPr>
+                <w:b/>
+                <w:bCs/>
+                <w:sz w:val="18"/>
+                <w:szCs w:val="18"/>
+              </w:rPr>
+              <w:t xml:space="preserve">Stage</w:t>
+            </w:r>
+          </w:p>
+        </w:tc>
+        <w:tc>
+          <w:tcPr>
+            <w:tcW w:type="dxa" w:w="800"/>
+            <w:shd w:fill="F2F2F2" w:val="clear"/>
+          </w:tcPr>
+          <w:p>
+            <w:r>
+              <w:rPr>
+                <w:b/>
+                <w:bCs/>
+                <w:sz w:val="18"/>
+                <w:szCs w:val="18"/>
+              </w:rPr>
+              <w:t xml:space="preserve">Thesis-critical</w:t>
+            </w:r>
+          </w:p>
+        </w:tc>
+      </w:tr>
+      <w:tr>
+        <w:tc>
+          <w:tcPr>
+            <w:tcW w:type="dxa" w:w="1100"/>
+          </w:tcPr>
+          <w:p>
+            <w:r>
+              <w:rPr>
+                <w:b w:val="false"/>
+                <w:bCs w:val="false"/>
+                <w:sz w:val="18"/>
+                <w:szCs w:val="18"/>
+              </w:rPr>
+              <w:t xml:space="preserve">capex</w:t>
+            </w:r>
+          </w:p>
+        </w:tc>
+        <w:tc>
+          <w:tcPr>
+            <w:tcW w:type="dxa" w:w="2600"/>
+          </w:tcPr>
+          <w:p>
+            <w:r>
+              <w:rPr>
+                <w:b w:val="false"/>
+                <w:bCs w:val="false"/>
+                <w:sz w:val="18"/>
+                <w:szCs w:val="18"/>
+              </w:rPr>
+              <w:t xml:space="preserve">Allana JV veg/RTC-RTE plant commercial scale-up</w:t>
+            </w:r>
+          </w:p>
+        </w:tc>
+        <w:tc>
+          <w:tcPr>
+            <w:tcW w:type="dxa" w:w="2400"/>
+          </w:tcPr>
+          <w:p>
+            <w:r>
+              <w:rPr>
+                <w:b w:val="false"/>
+                <w:bCs w:val="false"/>
+                <w:sz w:val="18"/>
+                <w:szCs w:val="18"/>
+              </w:rPr>
+              <w:t xml:space="preserve">Chatha 70% equity, Rs 40cr JV capex, 6 KTPA RTC + 4.5 KTPA RTE, Allana contractually buys 100% of output for export</w:t>
+            </w:r>
+          </w:p>
+        </w:tc>
+        <w:tc>
+          <w:tcPr>
+            <w:tcW w:type="dxa" w:w="900"/>
+          </w:tcPr>
+          <w:p>
+            <w:r>
+              <w:rPr>
+                <w:b w:val="false"/>
+                <w:bCs w:val="false"/>
+                <w:sz w:val="18"/>
+                <w:szCs w:val="18"/>
+              </w:rPr>
+              <w:t xml:space="preserve">6M</w:t>
+            </w:r>
+          </w:p>
+        </w:tc>
+        <w:tc>
+          <w:tcPr>
+            <w:tcW w:type="dxa" w:w="1200"/>
+          </w:tcPr>
+          <w:p>
+            <w:r>
+              <w:rPr>
+                <w:b w:val="false"/>
+                <w:bCs w:val="false"/>
+                <w:sz w:val="18"/>
+                <w:szCs w:val="18"/>
+              </w:rPr>
+              <w:t xml:space="preserve">operational</w:t>
+            </w:r>
+          </w:p>
+        </w:tc>
+        <w:tc>
+          <w:tcPr>
+            <w:tcW w:type="dxa" w:w="800"/>
+          </w:tcPr>
+          <w:p>
+            <w:r>
+              <w:rPr>
+                <w:b w:val="false"/>
+                <w:bCs w:val="false"/>
+                <w:sz w:val="18"/>
+                <w:szCs w:val="18"/>
+              </w:rPr>
+              <w:t xml:space="preserve">yes</w:t>
+            </w:r>
+          </w:p>
+        </w:tc>
+      </w:tr>
+      <w:tr>
+        <w:tc>
+          <w:tcPr>
+            <w:tcW w:type="dxa" w:w="1100"/>
+          </w:tcPr>
+          <w:p>
+            <w:r>
+              <w:rPr>
+                <w:b w:val="false"/>
+                <w:bCs w:val="false"/>
+                <w:sz w:val="18"/>
+                <w:szCs w:val="18"/>
+              </w:rPr>
+              <w:t xml:space="preserve">capacity</w:t>
+            </w:r>
+          </w:p>
+        </w:tc>
+        <w:tc>
+          <w:tcPr>
+            <w:tcW w:type="dxa" w:w="2600"/>
+          </w:tcPr>
+          <w:p>
+            <w:r>
+              <w:rPr>
+                <w:b w:val="false"/>
+                <w:bCs w:val="false"/>
+                <w:sz w:val="18"/>
+                <w:szCs w:val="18"/>
+              </w:rPr>
+              <w:t xml:space="preserve">New Mohali facility (flatbreads/gravies/frozen-to-fried) ramp to full utilisation</w:t>
+            </w:r>
+          </w:p>
+        </w:tc>
+        <w:tc>
+          <w:tcPr>
+            <w:tcW w:type="dxa" w:w="2400"/>
+          </w:tcPr>
+          <w:p>
+            <w:r>
+              <w:rPr>
+                <w:b w:val="false"/>
+                <w:bCs w:val="false"/>
+                <w:sz w:val="18"/>
+                <w:szCs w:val="18"/>
+              </w:rPr>
+              <w:t xml:space="preserve">Rs 42-44cr capex, 14 KTPA, peak revenue potential Rs 175-200cr, breakeven at 45% utilisation, guided 50-60% FY26 utilisation rising to full by FY28</w:t>
+            </w:r>
+          </w:p>
+        </w:tc>
+        <w:tc>
+          <w:tcPr>
+            <w:tcW w:type="dxa" w:w="900"/>
+          </w:tcPr>
+          <w:p>
+            <w:r>
+              <w:rPr>
+                <w:b w:val="false"/>
+                <w:bCs w:val="false"/>
+                <w:sz w:val="18"/>
+                <w:szCs w:val="18"/>
+              </w:rPr>
+              <w:t xml:space="preserve">FY28</w:t>
+            </w:r>
+          </w:p>
+        </w:tc>
+        <w:tc>
+          <w:tcPr>
+            <w:tcW w:type="dxa" w:w="1200"/>
+          </w:tcPr>
+          <w:p>
+            <w:r>
+              <w:rPr>
+                <w:b w:val="false"/>
+                <w:bCs w:val="false"/>
+                <w:sz w:val="18"/>
+                <w:szCs w:val="18"/>
+              </w:rPr>
+              <w:t xml:space="preserve">operational</w:t>
+            </w:r>
+          </w:p>
+        </w:tc>
+        <w:tc>
+          <w:tcPr>
+            <w:tcW w:type="dxa" w:w="800"/>
+          </w:tcPr>
+          <w:p>
+            <w:r>
+              <w:rPr>
+                <w:b w:val="false"/>
+                <w:bCs w:val="false"/>
+                <w:sz w:val="18"/>
+                <w:szCs w:val="18"/>
+              </w:rPr>
+              <w:t xml:space="preserve">yes</w:t>
+            </w:r>
+          </w:p>
+        </w:tc>
+      </w:tr>
+      <w:tr>
+        <w:tc>
+          <w:tcPr>
+            <w:tcW w:type="dxa" w:w="1100"/>
+          </w:tcPr>
+          <w:p>
+            <w:r>
+              <w:rPr>
+                <w:b w:val="false"/>
+                <w:bCs w:val="false"/>
+                <w:sz w:val="18"/>
+                <w:szCs w:val="18"/>
+              </w:rPr>
+              <w:t xml:space="preserve">growth</w:t>
+            </w:r>
+          </w:p>
+        </w:tc>
+        <w:tc>
+          <w:tcPr>
+            <w:tcW w:type="dxa" w:w="2600"/>
+          </w:tcPr>
+          <w:p>
+            <w:r>
+              <w:rPr>
+                <w:b w:val="false"/>
+                <w:bCs w:val="false"/>
+                <w:sz w:val="18"/>
+                <w:szCs w:val="18"/>
+              </w:rPr>
+              <w:t xml:space="preserve">Management guidance FY27-FY29 revenue Rs 325cr / 450cr / 550cr+</w:t>
+            </w:r>
+          </w:p>
+        </w:tc>
+        <w:tc>
+          <w:tcPr>
+            <w:tcW w:type="dxa" w:w="2400"/>
+          </w:tcPr>
+          <w:p>
+            <w:r>
+              <w:rPr>
+                <w:b w:val="false"/>
+                <w:bCs w:val="false"/>
+                <w:sz w:val="18"/>
+                <w:szCs w:val="18"/>
+              </w:rPr>
+              <w:t xml:space="preserve">implies ~96% YoY growth needed in FY27 alone vs FY26's actual +5.4%; PAT margin to 9-10% and PAT ~5-6x by FY29</w:t>
+            </w:r>
+          </w:p>
+        </w:tc>
+        <w:tc>
+          <w:tcPr>
+            <w:tcW w:type="dxa" w:w="900"/>
+          </w:tcPr>
+          <w:p>
+            <w:r>
+              <w:rPr>
+                <w:b w:val="false"/>
+                <w:bCs w:val="false"/>
+                <w:sz w:val="18"/>
+                <w:szCs w:val="18"/>
+              </w:rPr>
+              <w:t xml:space="preserve">FY27</w:t>
+            </w:r>
+          </w:p>
+        </w:tc>
+        <w:tc>
+          <w:tcPr>
+            <w:tcW w:type="dxa" w:w="1200"/>
+          </w:tcPr>
+          <w:p>
+            <w:r>
+              <w:rPr>
+                <w:b w:val="false"/>
+                <w:bCs w:val="false"/>
+                <w:sz w:val="18"/>
+                <w:szCs w:val="18"/>
+              </w:rPr>
+              <w:t xml:space="preserve">expectation</w:t>
+            </w:r>
+          </w:p>
+        </w:tc>
+        <w:tc>
+          <w:tcPr>
+            <w:tcW w:type="dxa" w:w="800"/>
+          </w:tcPr>
+          <w:p>
+            <w:r>
+              <w:rPr>
+                <w:b w:val="false"/>
+                <w:bCs w:val="false"/>
+                <w:sz w:val="18"/>
+                <w:szCs w:val="18"/>
+              </w:rPr>
+              <w:t xml:space="preserve">yes</w:t>
+            </w:r>
+          </w:p>
+        </w:tc>
+      </w:tr>
+      <w:tr>
+        <w:tc>
+          <w:tcPr>
+            <w:tcW w:type="dxa" w:w="1100"/>
+          </w:tcPr>
+          <w:p>
+            <w:r>
+              <w:rPr>
+                <w:b w:val="false"/>
+                <w:bCs w:val="false"/>
+                <w:sz w:val="18"/>
+                <w:szCs w:val="18"/>
+              </w:rPr>
+              <w:t xml:space="preserve">strategy</w:t>
+            </w:r>
+          </w:p>
+        </w:tc>
+        <w:tc>
+          <w:tcPr>
+            <w:tcW w:type="dxa" w:w="2600"/>
+          </w:tcPr>
+          <w:p>
+            <w:r>
+              <w:rPr>
+                <w:b w:val="false"/>
+                <w:bCs w:val="false"/>
+                <w:sz w:val="18"/>
+                <w:szCs w:val="18"/>
+              </w:rPr>
+              <w:t xml:space="preserve">Unifayre B2C/D2C brand launch (UAE/Gulf + domestic)</w:t>
+            </w:r>
+          </w:p>
+        </w:tc>
+        <w:tc>
+          <w:tcPr>
+            <w:tcW w:type="dxa" w:w="2400"/>
+          </w:tcPr>
+          <w:p>
+            <w:r>
+              <w:rPr>
+                <w:b w:val="false"/>
+                <w:bCs w:val="false"/>
+                <w:sz w:val="18"/>
+                <w:szCs w:val="18"/>
+              </w:rPr>
+              <w:t xml:space="preserve">new customer-facing brand unveiled; receivables already doubled YoY, marketing spend rising</w:t>
+            </w:r>
+          </w:p>
+        </w:tc>
+        <w:tc>
+          <w:tcPr>
+            <w:tcW w:type="dxa" w:w="900"/>
+          </w:tcPr>
+          <w:p>
+            <w:r>
+              <w:rPr>
+                <w:b w:val="false"/>
+                <w:bCs w:val="false"/>
+                <w:sz w:val="18"/>
+                <w:szCs w:val="18"/>
+              </w:rPr>
+              <w:t xml:space="preserve">12M</w:t>
+            </w:r>
+          </w:p>
+        </w:tc>
+        <w:tc>
+          <w:tcPr>
+            <w:tcW w:type="dxa" w:w="1200"/>
+          </w:tcPr>
+          <w:p>
+            <w:r>
+              <w:rPr>
+                <w:b w:val="false"/>
+                <w:bCs w:val="false"/>
+                <w:sz w:val="18"/>
+                <w:szCs w:val="18"/>
+              </w:rPr>
+              <w:t xml:space="preserve">action</w:t>
+            </w:r>
+          </w:p>
+        </w:tc>
+        <w:tc>
+          <w:tcPr>
+            <w:tcW w:type="dxa" w:w="800"/>
+          </w:tcPr>
+          <w:p>
+            <w:r>
+              <w:rPr>
+                <w:b w:val="false"/>
+                <w:bCs w:val="false"/>
+                <w:sz w:val="18"/>
+                <w:szCs w:val="18"/>
+              </w:rPr>
+              <w:t xml:space="preserve"/>
+            </w:r>
+          </w:p>
+        </w:tc>
+      </w:tr>
+    </w:tbl>
+    <w:p>
+      <w:pPr>
+        <w:spacing w:after="60" w:before="120"/>
+      </w:pPr>
+      <w:r>
+        <w:rPr>
+          <w:b/>
+          <w:bCs/>
+          <w:sz w:val="20"/>
+          <w:szCs w:val="20"/>
+        </w:rPr>
+        <w:t xml:space="preserve">Earnings chain: </w:t>
+      </w:r>
+      <w:r>
+        <w:rPr>
+          <w:b w:val="false"/>
+          <w:bCs w:val="false"/>
+          <w:sz w:val="20"/>
+          <w:szCs w:val="20"/>
+        </w:rPr>
+        <w:t xml:space="preserve">3x capacity (new Mohali plant + Allana JV) now online</w:t>
+      </w:r>
+      <w:r>
+        <w:rPr>
+          <w:color w:val="666666"/>
+          <w:sz w:val="20"/>
+          <w:szCs w:val="20"/>
+        </w:rPr>
+        <w:t xml:space="preserve"> → </w:t>
+      </w:r>
+      <w:r>
+        <w:rPr>
+          <w:b w:val="false"/>
+          <w:bCs w:val="false"/>
+          <w:sz w:val="20"/>
+          <w:szCs w:val="20"/>
+        </w:rPr>
+        <w:t xml:space="preserve">utilisation ramp / new anchor-client wins</w:t>
+      </w:r>
+      <w:r>
+        <w:rPr>
+          <w:color w:val="666666"/>
+          <w:sz w:val="20"/>
+          <w:szCs w:val="20"/>
+        </w:rPr>
+        <w:t xml:space="preserve"> → </w:t>
+      </w:r>
+      <w:r>
+        <w:rPr>
+          <w:b w:val="false"/>
+          <w:bCs w:val="false"/>
+          <w:sz w:val="20"/>
+          <w:szCs w:val="20"/>
+        </w:rPr>
+        <w:t xml:space="preserve">revenue growth toward the Rs 325cr+ FY27 guide</w:t>
+      </w:r>
+      <w:r>
+        <w:rPr>
+          <w:color w:val="666666"/>
+          <w:sz w:val="20"/>
+          <w:szCs w:val="20"/>
+        </w:rPr>
+        <w:t xml:space="preserve"> → </w:t>
+      </w:r>
+      <w:r>
+        <w:rPr>
+          <w:b w:val="false"/>
+          <w:bCs w:val="false"/>
+          <w:sz w:val="20"/>
+          <w:szCs w:val="20"/>
+        </w:rPr>
+        <w:t xml:space="preserve">operating leverage on a largely fixed cost base</w:t>
+      </w:r>
+      <w:r>
+        <w:rPr>
+          <w:color w:val="666666"/>
+          <w:sz w:val="20"/>
+          <w:szCs w:val="20"/>
+        </w:rPr>
+        <w:t xml:space="preserve"> → </w:t>
+      </w:r>
+      <w:r>
+        <w:rPr>
+          <w:b w:val="false"/>
+          <w:bCs w:val="false"/>
+          <w:sz w:val="20"/>
+          <w:szCs w:val="20"/>
+        </w:rPr>
+        <w:t xml:space="preserve">EBITDA margin to 12-13%</w:t>
+      </w:r>
+      <w:r>
+        <w:rPr>
+          <w:color w:val="666666"/>
+          <w:sz w:val="20"/>
+          <w:szCs w:val="20"/>
+        </w:rPr>
+        <w:t xml:space="preserve"> → </w:t>
+      </w:r>
+      <w:r>
+        <w:rPr>
+          <w:b w:val="false"/>
+          <w:bCs w:val="false"/>
+          <w:sz w:val="20"/>
+          <w:szCs w:val="20"/>
+        </w:rPr>
+        <w:t xml:space="preserve">PAT ~5-6x by FY29</w:t>
+      </w:r>
+    </w:p>
+    <w:p>
+      <w:pPr>
+        <w:spacing w:after="120"/>
+      </w:pPr>
+      <w:r>
+        <w:rPr>
+          <w:color w:val="666666"/>
+          <w:sz w:val="18"/>
+          <w:szCs w:val="18"/>
+        </w:rPr>
+        <w:t xml:space="preserve">Bottleneck link: utilisation ramp / new client wins - FY26 growth was only 5.4%, far short of what the guide needs.</w:t>
+      </w:r>
+    </w:p>
+    <w:p>
+      <w:pPr>
+        <w:spacing w:after="120"/>
+      </w:pPr>
+      <w:r>
+        <w:rPr>
+          <w:color w:val="666666"/>
+          <w:sz w:val="18"/>
+          <w:szCs w:val="18"/>
+        </w:rPr>
+        <w:t xml:space="preserve">Operating leverage: unclear - guided but FY26 showed only 19bps of margin expansion despite the capacity being complete</w:t>
+      </w:r>
+    </w:p>
+    <w:p>
+      <w:pPr>
+        <w:spacing w:after="120"/>
+      </w:pPr>
+      <w:r>
+        <w:rPr>
+          <w:color w:val="666666"/>
+          <w:sz w:val="18"/>
+          <w:szCs w:val="18"/>
+        </w:rPr>
+        <w:t xml:space="preserve">Evidenced: 3x capacity (new Mohali plant + Allana JV) now online. Still assumed: utilisation ramp / new anchor-client wins; revenue growth toward the Rs 325cr+ FY27 guide; operating leverage on a largely fixed cost base; EBITDA margin to 12-13%; PAT ~5-6x by FY29.</w:t>
       </w:r>
     </w:p>
     <w:p>
@@ -329,7 +1478,7 @@
           </w:tcPr>
           <w:p>
             <w:r>
-              <w:t xml:space="preserve">2026-09-09</w:t>
+              <w:t xml:space="preserve">2026-09-18</w:t>
             </w:r>
           </w:p>
         </w:tc>
@@ -356,7 +1505,7 @@
           </w:tcPr>
           <w:p>
             <w:r>
-              <w:t xml:space="preserve">Rs 108 · 39x P/E</w:t>
+              <w:t xml:space="preserve">Rs 105 · 37.9x P/E</w:t>
             </w:r>
           </w:p>
         </w:tc>
@@ -410,7 +1559,7 @@
           </w:tcPr>
           <w:p>
             <w:r>
-              <w:t xml:space="preserve">~39x TTM on depressed ~8% margins implies the market is fully pricing the operating-leverage recovery - PAT needs to roughly 3x as utilisation ramps to justify 39x at a 20-25x exit</w:t>
+              <w:t xml:space="preserve">~38x trailing on a 7.4% margin / 5.4%-growth base implies the market is still pricing management's guided ramp; PAT needs to compound roughly 35-45%/yr FY26-29 (mgmt's own 5-6x-by-FY29 guide) to justify today's multiple at a 20-25x exit</w:t>
             </w:r>
           </w:p>
         </w:tc>
@@ -437,7 +1586,7 @@
           </w:tcPr>
           <w:p>
             <w:r>
-              <w:t xml:space="preserve">revenue +20-25% on QSR demand and the just-completed 3x capacity; margin to 10-13% if utilisation ramps</w:t>
+              <w:t xml:space="preserve">The guided Rs 325cr+ FY27 revenue looks aggressive against a base that grew just 5.4% in FY26; a more realistic outcome is 15-25% growth with margin drifting toward 9-10% if the Allana JV and new plant ramp roughly on schedule</w:t>
             </w:r>
           </w:p>
         </w:tc>
@@ -464,7 +1613,7 @@
           </w:tcPr>
           <w:p>
             <w:r>
-              <w:t xml:space="preserve">PAT multi-x on operating leverage IF the ramp lands; B2C/export pivot adds working-capital and execution risk</w:t>
+              <w:t xml:space="preserve">PAT ramp is plausible only if utilisation, new B2B client wins and Unifayre B2C execution all land together; any one slipping pushes the FY29 guide out further</w:t>
             </w:r>
           </w:p>
         </w:tc>
@@ -572,7 +1721,7 @@
           </w:tcPr>
           <w:p>
             <w:r>
-              <w:t xml:space="preserve">the operating leverage is anticipated, not demonstrated (ROCE fell 19%-&gt;10% as capacity was added ahead of volume); at 39x the recovery is already in the price</w:t>
+              <w:t xml:space="preserve">Management's own FY27 guide (Rs 325cr, ~96% YoY) already implies the market's forward path; the swing factor is guidance credibility, which is weak (the FY25 20% growth guide was also missed) - the stock is priced for the guide, not for the trend actually delivered</w:t>
             </w:r>
           </w:p>
         </w:tc>
@@ -618,6 +1767,35 @@
           <w:szCs w:val="16"/>
         </w:rPr>
         <w:t xml:space="preserve">no broker consensus; implied path is a reverse-P/E estimate + screener.in forward figures + VP thread view</w:t>
+      </w:r>
+    </w:p>
+    <w:p>
+      <w:pPr>
+        <w:spacing w:after="120" w:before="120"/>
+      </w:pPr>
+      <w:r>
+        <w:rPr>
+          <w:b/>
+          <w:bCs/>
+          <w:sz w:val="20"/>
+          <w:szCs w:val="20"/>
+        </w:rPr>
+        <w:t xml:space="preserve">Catalyst: </w:t>
+      </w:r>
+      <w:r>
+        <w:rPr>
+          <w:sz w:val="20"/>
+          <w:szCs w:val="20"/>
+        </w:rPr>
+        <w:t xml:space="preserve">Q2/Q3 FY27 prints showing whether the utilisation ramp + Allana JV offtake actually deliver against the Rs 325cr FY27 guide</w:t>
+      </w:r>
+      <w:r>
+        <w:rPr>
+          <w:color w:val="666666"/>
+          <w:sz w:val="18"/>
+          <w:szCs w:val="18"/>
+        </w:rPr>
+        <w:t xml:space="preserve"> (window ~6M from 2026-09-18; undated; evidence low; pending)</w:t>
       </w:r>
     </w:p>
     <w:p>
@@ -750,7 +1928,7 @@
           </w:tcPr>
           <w:p>
             <w:r>
-              <w:t xml:space="preserve">—</w:t>
+              <w:t xml:space="preserve">filling the newly-tripled capacity with anchor customers - the standalone new veg plant has no disclosed committed clients</w:t>
             </w:r>
           </w:p>
         </w:tc>
@@ -777,7 +1955,7 @@
           </w:tcPr>
           <w:p>
             <w:r>
-              <w:t xml:space="preserve">—</w:t>
+              <w:t xml:space="preserve">adding</w:t>
             </w:r>
           </w:p>
         </w:tc>
@@ -804,7 +1982,7 @@
           </w:tcPr>
           <w:p>
             <w:r>
-              <w:t xml:space="preserve">—</w:t>
+              <w:t xml:space="preserve">Vadilal Industries (frozen), Godrej Tyson Foods (unlisted, processed meat), Venky's India (integrated poultry)</w:t>
             </w:r>
           </w:p>
         </w:tc>
@@ -813,6 +1991,19 @@
     <w:p>
       <w:pPr>
         <w:spacing w:after="120"/>
+      </w:pPr>
+      <w:r>
+        <w:rPr>
+          <w:color w:val="666666"/>
+          <w:sz w:val="18"/>
+          <w:szCs w:val="18"/>
+        </w:rPr>
+        <w:t xml:space="preserve">Chatha itself just added ~3x processing capacity ahead of demonstrated demand - a company-specific late-cycle-glut risk until utilisation and new-client wins catch up; the QSR-outsourcing tailwind for the industry as a whole remains intact.</w:t>
+      </w:r>
+    </w:p>
+    <w:p>
+      <w:pPr>
+        <w:spacing w:after="60" w:before="120"/>
       </w:pPr>
       <w:r>
         <w:rPr>
@@ -821,7 +2012,114 @@
           <w:sz w:val="20"/>
           <w:szCs w:val="20"/>
         </w:rPr>
-        <w:t xml:space="preserve">Quality metrics (ROCE · debt · FCF · margin · capex):</w:t>
+        <w:t xml:space="preserve">Earnings quality: </w:t>
+      </w:r>
+      <w:r>
+        <w:rPr>
+          <w:sz w:val="20"/>
+          <w:szCs w:val="20"/>
+        </w:rPr>
+        <w:t xml:space="preserve">margin driver unclear</w:t>
+      </w:r>
+      <w:r>
+        <w:rPr>
+          <w:b/>
+          <w:bCs/>
+          <w:color w:val="A32020"/>
+          <w:sz w:val="20"/>
+          <w:szCs w:val="20"/>
+        </w:rPr>
+        <w:t xml:space="preserve"/>
+      </w:r>
+    </w:p>
+    <w:p>
+      <w:pPr>
+        <w:spacing w:after="120"/>
+      </w:pPr>
+      <w:r>
+        <w:rPr>
+          <w:color w:val="666666"/>
+          <w:sz w:val="18"/>
+          <w:szCs w:val="18"/>
+        </w:rPr>
+        <w:t xml:space="preserve">Drivers: capacity utilisation (still low, ramping); input/protein cost pass-through; new B2C (Unifayre) marketing and working-capital spend.</w:t>
+      </w:r>
+    </w:p>
+    <w:p>
+      <w:pPr>
+        <w:spacing w:after="120"/>
+      </w:pPr>
+      <w:r>
+        <w:rPr>
+          <w:color w:val="666666"/>
+          <w:sz w:val="18"/>
+          <w:szCs w:val="18"/>
+        </w:rPr>
+        <w:t xml:space="preserve">Current 7.4% EBITDA margin is a trough, not a peak - it sits well below the 12-13% management guides for FY26-27; no peak-margin risk, but no evidence yet that the trough is turning either.</w:t>
+      </w:r>
+    </w:p>
+    <w:p>
+      <w:pPr>
+        <w:spacing w:after="60" w:before="120"/>
+      </w:pPr>
+      <w:r>
+        <w:rPr>
+          <w:b/>
+          <w:bCs/>
+          <w:sz w:val="20"/>
+          <w:szCs w:val="20"/>
+        </w:rPr>
+        <w:t xml:space="preserve">Growth trajectory: </w:t>
+      </w:r>
+      <w:r>
+        <w:rPr>
+          <w:b/>
+          <w:bCs/>
+          <w:color w:val="A32020"/>
+          <w:sz w:val="20"/>
+          <w:szCs w:val="20"/>
+        </w:rPr>
+        <w:t xml:space="preserve">YoY growth rate is decelerating</w:t>
+      </w:r>
+    </w:p>
+    <w:p>
+      <w:pPr>
+        <w:spacing w:after="120"/>
+      </w:pPr>
+      <w:r>
+        <w:rPr>
+          <w:color w:val="666666"/>
+          <w:sz w:val="18"/>
+          <w:szCs w:val="18"/>
+        </w:rPr>
+        <w:t xml:space="preserve">Revenue CAGR has decelerated from ~22% (5yr) to ~12% (3yr) to ~5.4% (FY26/TTM); H1 FY26 revenue ~Rs 84cr vs H2 FY25 ~Rs 83cr shows little visible acceleration despite the 3x capacity coming online during the period.</w:t>
+      </w:r>
+    </w:p>
+    <w:p>
+      <w:pPr>
+        <w:spacing w:after="120"/>
+      </w:pPr>
+      <w:r>
+        <w:rPr>
+          <w:color w:val="666666"/>
+          <w:sz w:val="18"/>
+          <w:szCs w:val="18"/>
+        </w:rPr>
+        <w:t xml:space="preserve">Reverse P/E: ~38x trailing needs a sharp re-acceleration (management's own guide implies ~96% FY27 growth) that the last two years of prints show no sign of yet.</w:t>
+      </w:r>
+    </w:p>
+    <w:p>
+      <w:pPr>
+        <w:spacing w:after="120"/>
+      </w:pPr>
+      <w:r>
+        <w:rPr>
+          <w:b/>
+          <w:bCs/>
+          <w:sz w:val="20"/>
+          <w:szCs w:val="20"/>
+        </w:rPr>
+        <w:t xml:space="preserve">Management quality (TVGP's "P"):</w:t>
       </w:r>
     </w:p>
     <w:tbl>
@@ -879,6 +2177,199 @@
                 <w:b/>
                 <w:bCs/>
               </w:rPr>
+              <w:t xml:space="preserve">Capital allocation</w:t>
+            </w:r>
+          </w:p>
+        </w:tc>
+        <w:tc>
+          <w:tcPr>
+            <w:tcW w:type="dxa" w:w="5800"/>
+          </w:tcPr>
+          <w:p>
+            <w:r>
+              <w:t xml:space="preserve">Rs 42-44cr new plant + Rs 40cr Allana JV (70% Chatha equity) funded via modest debt (~Rs 26cr) plus an equity raise; capacity built well ahead of demonstrated demand, with returns not yet proven (unclear)</w:t>
+            </w:r>
+          </w:p>
+        </w:tc>
+      </w:tr>
+      <w:tr>
+        <w:tc>
+          <w:tcPr>
+            <w:tcW w:type="dxa" w:w="3200"/>
+            <w:shd w:fill="F2F2F2" w:val="clear"/>
+          </w:tcPr>
+          <w:p>
+            <w:r>
+              <w:rPr>
+                <w:b/>
+                <w:bCs/>
+              </w:rPr>
+              <w:t xml:space="preserve">Related-party trend</w:t>
+            </w:r>
+          </w:p>
+        </w:tc>
+        <w:tc>
+          <w:tcPr>
+            <w:tcW w:type="dxa" w:w="5800"/>
+          </w:tcPr>
+          <w:p>
+            <w:r>
+              <w:t xml:space="preserve">unclear</w:t>
+            </w:r>
+          </w:p>
+        </w:tc>
+      </w:tr>
+      <w:tr>
+        <w:tc>
+          <w:tcPr>
+            <w:tcW w:type="dxa" w:w="3200"/>
+            <w:shd w:fill="F2F2F2" w:val="clear"/>
+          </w:tcPr>
+          <w:p>
+            <w:r>
+              <w:rPr>
+                <w:b/>
+                <w:bCs/>
+              </w:rPr>
+              <w:t xml:space="preserve">Guidance credibility</w:t>
+            </w:r>
+          </w:p>
+        </w:tc>
+        <w:tc>
+          <w:tcPr>
+            <w:tcW w:type="dxa" w:w="5800"/>
+          </w:tcPr>
+          <w:p>
+            <w:r>
+              <w:t xml:space="preserve">over-promises</w:t>
+            </w:r>
+          </w:p>
+        </w:tc>
+      </w:tr>
+      <w:tr>
+        <w:tc>
+          <w:tcPr>
+            <w:tcW w:type="dxa" w:w="3200"/>
+            <w:shd w:fill="F2F2F2" w:val="clear"/>
+          </w:tcPr>
+          <w:p>
+            <w:r>
+              <w:rPr>
+                <w:b/>
+                <w:bCs/>
+              </w:rPr>
+              <w:t xml:space="preserve">Shareholder returns</w:t>
+            </w:r>
+          </w:p>
+        </w:tc>
+        <w:tc>
+          <w:tcPr>
+            <w:tcW w:type="dxa" w:w="5800"/>
+          </w:tcPr>
+          <w:p>
+            <w:r>
+              <w:t xml:space="preserve">none</w:t>
+            </w:r>
+          </w:p>
+        </w:tc>
+      </w:tr>
+      <w:tr>
+        <w:tc>
+          <w:tcPr>
+            <w:tcW w:type="dxa" w:w="3200"/>
+            <w:shd w:fill="F2F2F2" w:val="clear"/>
+          </w:tcPr>
+          <w:p>
+            <w:r>
+              <w:rPr>
+                <w:b/>
+                <w:bCs/>
+              </w:rPr>
+              <w:t xml:space="preserve">Capability ladder / VAP</w:t>
+            </w:r>
+          </w:p>
+        </w:tc>
+        <w:tc>
+          <w:tcPr>
+            <w:tcW w:type="dxa" w:w="5800"/>
+          </w:tcPr>
+          <w:p>
+            <w:r>
+              <w:t xml:space="preserve">Explicit move from commodity B2B processing to a branded 'Unifayre' D2C/export line, plus Allana-JV-enabled Middle East export access</w:t>
+            </w:r>
+          </w:p>
+        </w:tc>
+      </w:tr>
+    </w:tbl>
+    <w:p>
+      <w:pPr>
+        <w:spacing w:after="120"/>
+      </w:pPr>
+      <w:r>
+        <w:rPr>
+          <w:b/>
+          <w:bCs/>
+          <w:sz w:val="20"/>
+          <w:szCs w:val="20"/>
+        </w:rPr>
+        <w:t xml:space="preserve">Quality metrics (ROCE · debt · FCF · margin · capex):</w:t>
+      </w:r>
+    </w:p>
+    <w:tbl>
+      <w:tblPr>
+        <w:tblW w:type="dxa" w:w="9000"/>
+        <w:tblBorders>
+          <w:top w:val="single" w:color="auto" w:sz="4"/>
+          <w:left w:val="single" w:color="auto" w:sz="4"/>
+          <w:bottom w:val="single" w:color="auto" w:sz="4"/>
+          <w:right w:val="single" w:color="auto" w:sz="4"/>
+          <w:insideH w:val="single" w:color="auto" w:sz="4"/>
+          <w:insideV w:val="single" w:color="auto" w:sz="4"/>
+        </w:tblBorders>
+      </w:tblPr>
+      <w:tblGrid>
+        <w:gridCol w:w="3200"/>
+        <w:gridCol w:w="5800"/>
+      </w:tblGrid>
+      <w:tr>
+        <w:tc>
+          <w:tcPr>
+            <w:tcW w:type="dxa" w:w="3200"/>
+            <w:shd w:fill="F2F2F2" w:val="clear"/>
+          </w:tcPr>
+          <w:p>
+            <w:r>
+              <w:rPr>
+                <w:b/>
+                <w:bCs/>
+              </w:rPr>
+              <w:t xml:space="preserve">Assessment</w:t>
+            </w:r>
+          </w:p>
+        </w:tc>
+        <w:tc>
+          <w:tcPr>
+            <w:tcW w:type="dxa" w:w="5800"/>
+          </w:tcPr>
+          <w:p>
+            <w:r>
+              <w:t xml:space="preserve">concern</w:t>
+            </w:r>
+          </w:p>
+        </w:tc>
+      </w:tr>
+      <w:tr>
+        <w:tc>
+          <w:tcPr>
+            <w:tcW w:type="dxa" w:w="3200"/>
+            <w:shd w:fill="F2F2F2" w:val="clear"/>
+          </w:tcPr>
+          <w:p>
+            <w:r>
+              <w:rPr>
+                <w:b/>
+                <w:bCs/>
+              </w:rPr>
               <w:t xml:space="preserve">ROCE</w:t>
             </w:r>
           </w:p>
@@ -889,7 +2380,7 @@
           </w:tcPr>
           <w:p>
             <w:r>
-              <w:t xml:space="preserve">10% (declining)</w:t>
+              <w:t xml:space="preserve">9.5% (declining)</w:t>
             </w:r>
           </w:p>
         </w:tc>
@@ -916,7 +2407,7 @@
           </w:tcPr>
           <w:p>
             <w:r>
-              <w:t xml:space="preserve">Net debt/EBITDA 2x</w:t>
+              <w:t xml:space="preserve">Net debt/EBITDA 2.1x</w:t>
             </w:r>
           </w:p>
         </w:tc>
@@ -1034,7 +2525,7 @@
           <w:sz w:val="18"/>
           <w:szCs w:val="18"/>
         </w:rPr>
-        <w:t xml:space="preserve">FY24 (+14.5%/12%) and FY25 (+17.2%/10%) missed on ROCE; FY26 (+5.7%) missed on revenue growth. ROCE fell from 19% (FY23) to ~10% as the 3x capacity expansion landed ahead of volume - no year clears both filters yet.</w:t>
+        <w:t xml:space="preserve">FY24 (+14.5% rev/12% ROCE) and FY25 (+17.2% rev/10% ROCE) missed on ROCE (&lt;15%); FY26 (+5.7% rev) missed on revenue growth (&lt;10%) and ROCE (~9.5%). ROCE fell from ~19% (FY23) to ~9.5% as the 3x capacity expansion landed ahead of volume - no year clears both filters yet. Independent source (MoneyWorks4Me) corroborates a longer erratic history: ROCE swung from 25.8% (FY19) to -15.8% (FY21) to 11.9% (FY25).</w:t>
       </w:r>
     </w:p>
     <w:p>
@@ -1043,62 +2534,7 @@
         <w:spacing w:after="120" w:before="280"/>
       </w:pPr>
       <w:r>
-        <w:t xml:space="preserve">Technical Read (Weekly / Monthly MACD + Bollinger Bands, or RSI/CCI/Williams %R proxy)</w:t>
-      </w:r>
-    </w:p>
-    <w:p>
-      <w:pPr>
-        <w:spacing w:after="120"/>
-      </w:pPr>
-      <w:r>
-        <w:t xml:space="preserve">Not pulled - the call rests on whether the operating leverage shows up in FY27 numbers, not chart position.</w:t>
-      </w:r>
-    </w:p>
-    <w:p>
-      <w:pPr>
-        <w:pStyle w:val="Heading1"/>
-        <w:spacing w:after="120" w:before="280"/>
-      </w:pPr>
-      <w:r>
-        <w:t xml:space="preserve">ValuePickr Community Signal</w:t>
-      </w:r>
-    </w:p>
-    <w:p>
-      <w:pPr>
-        <w:spacing w:after="120"/>
-      </w:pPr>
-      <w:r>
-        <w:t xml:space="preserve">34-post thread, cautiously positive and engaged. Strong appreciation for Chatha's transparency - it publishes transcripts of closed-door PMS/fund-manager calls, which Marathondreams (trusted, elevated) singled out. Debate centres on the B2C pivot: some (Marathondreams) see higher long-run growth/margin if executed in a calibrated way; others (sandesh, AnkitAgrawal) find it strange to launch B2C while the Allana JV and veg plant are still ramping, and worry it signals a thin B2B client pipeline for the new capacity. Latest post (Sep-26): Marathondreams on the FY26 annual report, 'founder promoter comes across as honest hard working... ready for the grind'.</w:t>
-      </w:r>
-    </w:p>
-    <w:p>
-      <w:pPr>
-        <w:spacing w:after="120"/>
-      </w:pPr>
-      <w:r>
-        <w:rPr>
-          <w:b/>
-          <w:bCs/>
-          <w:sz w:val="20"/>
-          <w:szCs w:val="20"/>
-        </w:rPr>
-        <w:t xml:space="preserve">High-conviction call from a top contributor: </w:t>
-      </w:r>
-      <w:r>
-        <w:rPr>
-          <w:sz w:val="20"/>
-          <w:szCs w:val="20"/>
-        </w:rPr>
-        <w:t xml:space="preserve">Marathondreams (trusted, elevated tier - not core) has been invested for ~1 year and repeatedly states 'continues to add as story improves' - a sustained accumulate, not a one-shot high-conviction call. Broad community tenor is constructive-but-watchful on execution and the B2C pivot.</w:t>
-      </w:r>
-    </w:p>
-    <w:p>
-      <w:pPr>
-        <w:pStyle w:val="Heading1"/>
-        <w:spacing w:after="120" w:before="280"/>
-      </w:pPr>
-      <w:r>
-        <w:t xml:space="preserve">Trusted-User Signals (Ongoing)</w:t>
+        <w:t xml:space="preserve">Fundamentals-Gap Checks (shareholding · working capital · sector KPIs · scenario analysis)</w:t>
       </w:r>
     </w:p>
     <w:p>
@@ -1113,12 +2549,12 @@
           <w:sz w:val="18"/>
           <w:szCs w:val="18"/>
         </w:rPr>
-        <w:t xml:space="preserve">Every time a trusted user expresses clear conviction on this stock, most recent first — this section accumulates over time, it isn't a one-time snapshot.</w:t>
-      </w:r>
-    </w:p>
-    <w:p>
-      <w:pPr>
-        <w:spacing w:after="100"/>
+        <w:t xml:space="preserve">Extra fundamentals extracted from the same filings — informational only, not yet consumed by any scoring script.</w:t>
+      </w:r>
+    </w:p>
+    <w:p>
+      <w:pPr>
+        <w:spacing w:after="120"/>
       </w:pPr>
       <w:r>
         <w:rPr>
@@ -1127,8 +2563,461 @@
           <w:sz w:val="20"/>
           <w:szCs w:val="20"/>
         </w:rPr>
-        <w:t xml:space="preserve">2026-09-06 — Marathondreams</w:t>
-      </w:r>
+        <w:t xml:space="preserve">Shareholding pattern:</w:t>
+      </w:r>
+    </w:p>
+    <w:tbl>
+      <w:tblPr>
+        <w:tblW w:type="dxa" w:w="9000"/>
+        <w:tblBorders>
+          <w:top w:val="single" w:color="auto" w:sz="4"/>
+          <w:left w:val="single" w:color="auto" w:sz="4"/>
+          <w:bottom w:val="single" w:color="auto" w:sz="4"/>
+          <w:right w:val="single" w:color="auto" w:sz="4"/>
+          <w:insideH w:val="single" w:color="auto" w:sz="4"/>
+          <w:insideV w:val="single" w:color="auto" w:sz="4"/>
+        </w:tblBorders>
+      </w:tblPr>
+      <w:tblGrid>
+        <w:gridCol w:w="3200"/>
+        <w:gridCol w:w="5800"/>
+      </w:tblGrid>
+      <w:tr>
+        <w:tc>
+          <w:tcPr>
+            <w:tcW w:type="dxa" w:w="3200"/>
+            <w:shd w:fill="F2F2F2" w:val="clear"/>
+          </w:tcPr>
+          <w:p>
+            <w:r>
+              <w:rPr>
+                <w:b/>
+                <w:bCs/>
+              </w:rPr>
+              <w:t xml:space="preserve">Promoter %</w:t>
+            </w:r>
+          </w:p>
+        </w:tc>
+        <w:tc>
+          <w:tcPr>
+            <w:tcW w:type="dxa" w:w="5800"/>
+          </w:tcPr>
+          <w:p>
+            <w:r>
+              <w:t xml:space="preserve">55.77% (stable)</w:t>
+            </w:r>
+          </w:p>
+        </w:tc>
+      </w:tr>
+      <w:tr>
+        <w:tc>
+          <w:tcPr>
+            <w:tcW w:type="dxa" w:w="3200"/>
+            <w:shd w:fill="F2F2F2" w:val="clear"/>
+          </w:tcPr>
+          <w:p>
+            <w:r>
+              <w:rPr>
+                <w:b/>
+                <w:bCs/>
+              </w:rPr>
+              <w:t xml:space="preserve">Pledge %</w:t>
+            </w:r>
+          </w:p>
+        </w:tc>
+        <w:tc>
+          <w:tcPr>
+            <w:tcW w:type="dxa" w:w="5800"/>
+          </w:tcPr>
+          <w:p>
+            <w:r>
+              <w:t xml:space="preserve">0% (stable)</w:t>
+            </w:r>
+          </w:p>
+        </w:tc>
+      </w:tr>
+      <w:tr>
+        <w:tc>
+          <w:tcPr>
+            <w:tcW w:type="dxa" w:w="3200"/>
+            <w:shd w:fill="F2F2F2" w:val="clear"/>
+          </w:tcPr>
+          <w:p>
+            <w:r>
+              <w:rPr>
+                <w:b/>
+                <w:bCs/>
+              </w:rPr>
+              <w:t xml:space="preserve">FII/DII %</w:t>
+            </w:r>
+          </w:p>
+        </w:tc>
+        <w:tc>
+          <w:tcPr>
+            <w:tcW w:type="dxa" w:w="5800"/>
+          </w:tcPr>
+          <w:p>
+            <w:r>
+              <w:t xml:space="preserve">16.21% (unclear)</w:t>
+            </w:r>
+          </w:p>
+        </w:tc>
+      </w:tr>
+      <w:tr>
+        <w:tc>
+          <w:tcPr>
+            <w:tcW w:type="dxa" w:w="3200"/>
+            <w:shd w:fill="F2F2F2" w:val="clear"/>
+          </w:tcPr>
+          <w:p>
+            <w:r>
+              <w:rPr>
+                <w:b/>
+                <w:bCs/>
+              </w:rPr>
+              <w:t xml:space="preserve">Quarters checked</w:t>
+            </w:r>
+          </w:p>
+        </w:tc>
+        <w:tc>
+          <w:tcPr>
+            <w:tcW w:type="dxa" w:w="5800"/>
+          </w:tcPr>
+          <w:p>
+            <w:r>
+              <w:t xml:space="preserve">Q2FY26, Q3FY26, Q4FY26, Q1FY27</w:t>
+            </w:r>
+          </w:p>
+        </w:tc>
+      </w:tr>
+    </w:tbl>
+    <w:p>
+      <w:pPr>
+        <w:spacing w:after="120"/>
+      </w:pPr>
+      <w:r>
+        <w:rPr>
+          <w:color w:val="666666"/>
+          <w:sz w:val="18"/>
+          <w:szCs w:val="18"/>
+        </w:rPr>
+        <w:t xml:space="preserve">Promoter holding stable at ~55.6-55.8% with 0% pledge across the checked quarters - no promoter-exit signal. FII (2.86%) + DII (13.35%) institutional interest is modest but present.</w:t>
+      </w:r>
+    </w:p>
+    <w:p>
+      <w:pPr>
+        <w:spacing w:after="120"/>
+      </w:pPr>
+      <w:r>
+        <w:rPr>
+          <w:b/>
+          <w:bCs/>
+          <w:sz w:val="20"/>
+          <w:szCs w:val="20"/>
+        </w:rPr>
+        <w:t xml:space="preserve">Working capital:</w:t>
+      </w:r>
+    </w:p>
+    <w:tbl>
+      <w:tblPr>
+        <w:tblW w:type="dxa" w:w="9000"/>
+        <w:tblBorders>
+          <w:top w:val="single" w:color="auto" w:sz="4"/>
+          <w:left w:val="single" w:color="auto" w:sz="4"/>
+          <w:bottom w:val="single" w:color="auto" w:sz="4"/>
+          <w:right w:val="single" w:color="auto" w:sz="4"/>
+          <w:insideH w:val="single" w:color="auto" w:sz="4"/>
+          <w:insideV w:val="single" w:color="auto" w:sz="4"/>
+        </w:tblBorders>
+      </w:tblPr>
+      <w:tblGrid>
+        <w:gridCol w:w="3200"/>
+        <w:gridCol w:w="5800"/>
+      </w:tblGrid>
+      <w:tr>
+        <w:tc>
+          <w:tcPr>
+            <w:tcW w:type="dxa" w:w="3200"/>
+            <w:shd w:fill="F2F2F2" w:val="clear"/>
+          </w:tcPr>
+          <w:p>
+            <w:r>
+              <w:rPr>
+                <w:b/>
+                <w:bCs/>
+              </w:rPr>
+              <w:t xml:space="preserve">Inventory days</w:t>
+            </w:r>
+          </w:p>
+        </w:tc>
+        <w:tc>
+          <w:tcPr>
+            <w:tcW w:type="dxa" w:w="5800"/>
+          </w:tcPr>
+          <w:p>
+            <w:r>
+              <w:t xml:space="preserve">—</w:t>
+            </w:r>
+          </w:p>
+        </w:tc>
+      </w:tr>
+      <w:tr>
+        <w:tc>
+          <w:tcPr>
+            <w:tcW w:type="dxa" w:w="3200"/>
+            <w:shd w:fill="F2F2F2" w:val="clear"/>
+          </w:tcPr>
+          <w:p>
+            <w:r>
+              <w:rPr>
+                <w:b/>
+                <w:bCs/>
+              </w:rPr>
+              <w:t xml:space="preserve">Receivable days</w:t>
+            </w:r>
+          </w:p>
+        </w:tc>
+        <w:tc>
+          <w:tcPr>
+            <w:tcW w:type="dxa" w:w="5800"/>
+          </w:tcPr>
+          <w:p>
+            <w:r>
+              <w:t xml:space="preserve">—</w:t>
+            </w:r>
+          </w:p>
+        </w:tc>
+      </w:tr>
+      <w:tr>
+        <w:tc>
+          <w:tcPr>
+            <w:tcW w:type="dxa" w:w="3200"/>
+            <w:shd w:fill="F2F2F2" w:val="clear"/>
+          </w:tcPr>
+          <w:p>
+            <w:r>
+              <w:rPr>
+                <w:b/>
+                <w:bCs/>
+              </w:rPr>
+              <w:t xml:space="preserve">Payable days</w:t>
+            </w:r>
+          </w:p>
+        </w:tc>
+        <w:tc>
+          <w:tcPr>
+            <w:tcW w:type="dxa" w:w="5800"/>
+          </w:tcPr>
+          <w:p>
+            <w:r>
+              <w:t xml:space="preserve">—</w:t>
+            </w:r>
+          </w:p>
+        </w:tc>
+      </w:tr>
+      <w:tr>
+        <w:tc>
+          <w:tcPr>
+            <w:tcW w:type="dxa" w:w="3200"/>
+            <w:shd w:fill="F2F2F2" w:val="clear"/>
+          </w:tcPr>
+          <w:p>
+            <w:r>
+              <w:rPr>
+                <w:b/>
+                <w:bCs/>
+              </w:rPr>
+              <w:t xml:space="preserve">Cash conversion cycle</w:t>
+            </w:r>
+          </w:p>
+        </w:tc>
+        <w:tc>
+          <w:tcPr>
+            <w:tcW w:type="dxa" w:w="5800"/>
+          </w:tcPr>
+          <w:p>
+            <w:r>
+              <w:t xml:space="preserve">42</w:t>
+            </w:r>
+          </w:p>
+        </w:tc>
+      </w:tr>
+      <w:tr>
+        <w:tc>
+          <w:tcPr>
+            <w:tcW w:type="dxa" w:w="3200"/>
+            <w:shd w:fill="F2F2F2" w:val="clear"/>
+          </w:tcPr>
+          <w:p>
+            <w:r>
+              <w:rPr>
+                <w:b/>
+                <w:bCs/>
+              </w:rPr>
+              <w:t xml:space="preserve">3y trend</w:t>
+            </w:r>
+          </w:p>
+        </w:tc>
+        <w:tc>
+          <w:tcPr>
+            <w:tcW w:type="dxa" w:w="5800"/>
+          </w:tcPr>
+          <w:p>
+            <w:r>
+              <w:t xml:space="preserve">elongating</w:t>
+            </w:r>
+          </w:p>
+        </w:tc>
+      </w:tr>
+      <w:tr>
+        <w:tc>
+          <w:tcPr>
+            <w:tcW w:type="dxa" w:w="3200"/>
+            <w:shd w:fill="F2F2F2" w:val="clear"/>
+          </w:tcPr>
+          <w:p>
+            <w:r>
+              <w:rPr>
+                <w:b/>
+                <w:bCs/>
+              </w:rPr>
+              <w:t xml:space="preserve">Vs sector</w:t>
+            </w:r>
+          </w:p>
+        </w:tc>
+        <w:tc>
+          <w:tcPr>
+            <w:tcW w:type="dxa" w:w="5800"/>
+          </w:tcPr>
+          <w:p>
+            <w:r>
+              <w:t xml:space="preserve">unclear</w:t>
+            </w:r>
+          </w:p>
+        </w:tc>
+      </w:tr>
+    </w:tbl>
+    <w:p>
+      <w:pPr>
+        <w:spacing w:after="120"/>
+      </w:pPr>
+      <w:r>
+        <w:rPr>
+          <w:color w:val="666666"/>
+          <w:sz w:val="18"/>
+          <w:szCs w:val="18"/>
+        </w:rPr>
+        <w:t xml:space="preserve">Cash conversion cycle lengthened from ~24 days to ~42 days (per MoneyWorks4Me, FY25) and trade receivables doubled YoY (Rs 11cr -&gt; Rs 22cr) - a genuine cash-drag warning that coincides with the Unifayre B2C launch, though revenue growth itself has been modest (+5.4% FY26), so this isn't yet a growth-funded-by-working-capital story so much as a margin/collections one.</w:t>
+      </w:r>
+    </w:p>
+    <w:p>
+      <w:pPr>
+        <w:spacing w:after="120"/>
+      </w:pPr>
+      <w:r>
+        <w:rPr>
+          <w:b/>
+          <w:bCs/>
+          <w:sz w:val="20"/>
+          <w:szCs w:val="20"/>
+        </w:rPr>
+        <w:t xml:space="preserve">Sector KPIs:</w:t>
+      </w:r>
+    </w:p>
+    <w:p>
+      <w:pPr>
+        <w:pStyle w:val="ListParagraph"/>
+        <w:numPr>
+          <w:ilvl w:val="0"/>
+          <w:numId w:val="1"/>
+        </w:numPr>
+        <w:spacing w:after="60"/>
+      </w:pPr>
+      <w:r>
+        <w:t xml:space="preserve">New-capacity utilisation: guided 50-60% FY26, full by FY28; breakeven at ~45% (unclear) — no independently disclosed actual utilisation figure found this pass - management guide only</w:t>
+      </w:r>
+    </w:p>
+    <w:p>
+      <w:pPr>
+        <w:pStyle w:val="ListParagraph"/>
+        <w:numPr>
+          <w:ilvl w:val="0"/>
+          <w:numId w:val="1"/>
+        </w:numPr>
+        <w:spacing w:after="60"/>
+      </w:pPr>
+      <w:r>
+        <w:t xml:space="preserve">Allana JV offtake: 100% of JV output contractually purchased by Allana for export (improving) — operational readiness achieved; commercial scale-up guided Jul-2026</w:t>
+      </w:r>
+    </w:p>
+    <w:p>
+      <w:pPr>
+        <w:pStyle w:val="Heading1"/>
+        <w:spacing w:after="120" w:before="280"/>
+      </w:pPr>
+      <w:r>
+        <w:t xml:space="preserve">Technical Read (Weekly / Monthly MACD + Bollinger Bands, or RSI/CCI/Williams %R proxy)</w:t>
+      </w:r>
+    </w:p>
+    <w:p>
+      <w:pPr>
+        <w:spacing w:after="120"/>
+      </w:pPr>
+      <w:r>
+        <w:t xml:space="preserve">Not pulled - the call rests on whether the operating leverage shows up in FY27 numbers, not chart position.</w:t>
+      </w:r>
+    </w:p>
+    <w:p>
+      <w:pPr>
+        <w:pStyle w:val="Heading1"/>
+        <w:spacing w:after="120" w:before="280"/>
+      </w:pPr>
+      <w:r>
+        <w:t xml:space="preserve">ValuePickr Community Signal</w:t>
+      </w:r>
+    </w:p>
+    <w:p>
+      <w:pPr>
+        <w:spacing w:after="120"/>
+      </w:pPr>
+      <w:r>
+        <w:t xml:space="preserve">34-post thread, cautiously positive and engaged. Strong appreciation for Chatha's transparency - it publishes transcripts of closed-door PMS/fund-manager calls, which Marathondreams (trusted, elevated) singled out. Debate centres on the B2C pivot: some (Marathondreams) see higher long-run growth/margin if executed in a calibrated way; others (sandesh, AnkitAgrawal) find it strange to launch B2C while the Allana JV and veg plant are still ramping, and worry it signals a thin B2B client pipeline for the new capacity. Latest post (Sep-26): Marathondreams on the FY26 annual report, 'founder promoter comes across as honest hard working... ready for the grind'.</w:t>
+      </w:r>
+    </w:p>
+    <w:p>
+      <w:pPr>
+        <w:spacing w:after="120"/>
+      </w:pPr>
+      <w:r>
+        <w:rPr>
+          <w:b/>
+          <w:bCs/>
+          <w:sz w:val="20"/>
+          <w:szCs w:val="20"/>
+        </w:rPr>
+        <w:t xml:space="preserve">High-conviction call from a top contributor: </w:t>
+      </w:r>
+      <w:r>
+        <w:rPr>
+          <w:sz w:val="20"/>
+          <w:szCs w:val="20"/>
+        </w:rPr>
+        <w:t xml:space="preserve">Marathondreams (trusted, elevated tier - not core) has been invested for ~1 year and repeatedly states 'continues to add as story improves' - a sustained accumulate, not a one-shot high-conviction call. Broad community tenor is constructive-but-watchful on execution and the B2C pivot.</w:t>
+      </w:r>
+    </w:p>
+    <w:p>
+      <w:pPr>
+        <w:pStyle w:val="Heading1"/>
+        <w:spacing w:after="120" w:before="280"/>
+      </w:pPr>
+      <w:r>
+        <w:t xml:space="preserve">Trusted-User Signals (Ongoing)</w:t>
+      </w:r>
+    </w:p>
+    <w:p>
+      <w:pPr>
+        <w:spacing w:after="120"/>
+      </w:pPr>
       <w:r>
         <w:rPr>
           <w:i/>
@@ -1137,6 +3026,30 @@
           <w:sz w:val="18"/>
           <w:szCs w:val="18"/>
         </w:rPr>
+        <w:t xml:space="preserve">Every time a trusted user expresses clear conviction on this stock, most recent first — this section accumulates over time, it isn't a one-time snapshot.</w:t>
+      </w:r>
+    </w:p>
+    <w:p>
+      <w:pPr>
+        <w:spacing w:after="100"/>
+      </w:pPr>
+      <w:r>
+        <w:rPr>
+          <w:b/>
+          <w:bCs/>
+          <w:sz w:val="20"/>
+          <w:szCs w:val="20"/>
+        </w:rPr>
+        <w:t xml:space="preserve">2026-09-06 — Marathondreams</w:t>
+      </w:r>
+      <w:r>
+        <w:rPr>
+          <w:i/>
+          <w:iCs/>
+          <w:color w:val="666666"/>
+          <w:sz w:val="18"/>
+          <w:szCs w:val="18"/>
+        </w:rPr>
         <w:t xml:space="preserve"> (Chatha Foods - a proxy play for QSR)</w:t>
       </w:r>
       <w:r>
@@ -1162,7 +3075,7 @@
         <w:spacing w:after="120"/>
       </w:pPr>
       <w:r>
-        <w:t xml:space="preserve">No SEBI or fraud action found. Governance is a positive - publishes closed analyst-call transcripts, appointed CMO/COO and an IR firm in late 2025. No auditor or going-concern issues.</w:t>
+        <w:t xml:space="preserve">No SEBI or fraud action found. No promoter pledge (0% on ~55.6-55.8% holding, stable). No auditor resignation found. Governance is a positive - publishes closed analyst-call transcripts, appointed CMO/COO and an IR firm in late 2025.</w:t>
       </w:r>
     </w:p>
     <w:p>
@@ -1197,46 +3110,46 @@
         <w:spacing w:after="60"/>
       </w:pPr>
       <w:r>
-        <w:t xml:space="preserve">3x capacity expansion physically complete with low current utilisation - large latent operating leverage for FY27-FY28</w:t>
-      </w:r>
-    </w:p>
-    <w:p>
-      <w:pPr>
-        <w:pStyle w:val="ListParagraph"/>
-        <w:numPr>
-          <w:ilvl w:val="0"/>
-          <w:numId w:val="1"/>
-        </w:numPr>
-        <w:spacing w:after="60"/>
-      </w:pPr>
-      <w:r>
-        <w:t xml:space="preserve">Unusually transparent, honest, hands-on promoter; management bench being strengthened</w:t>
-      </w:r>
-    </w:p>
-    <w:p>
-      <w:pPr>
-        <w:pStyle w:val="ListParagraph"/>
-        <w:numPr>
-          <w:ilvl w:val="0"/>
-          <w:numId w:val="1"/>
-        </w:numPr>
-        <w:spacing w:after="60"/>
-      </w:pPr>
-      <w:r>
-        <w:t xml:space="preserve">Trusted VP user (Marathondreams) accumulating for a year; Allana JV FSSC certification opens Middle East export optionality</w:t>
-      </w:r>
-    </w:p>
-    <w:p>
-      <w:pPr>
-        <w:pStyle w:val="ListParagraph"/>
-        <w:numPr>
-          <w:ilvl w:val="0"/>
-          <w:numId w:val="1"/>
-        </w:numPr>
-        <w:spacing w:after="60"/>
-      </w:pPr>
-      <w:r>
-        <w:t xml:space="preserve">5-6 month customer audit cycles are a genuine entry barrier; profit CAGR ~29.7% over 5 years off a small base</w:t>
+        <w:t xml:space="preserve">3x capacity expansion physically complete; Allana JV has genuine committed offtake (Allana buys 100% of that line's output for export) - de-risks part of the new capacity</w:t>
+      </w:r>
+    </w:p>
+    <w:p>
+      <w:pPr>
+        <w:pStyle w:val="ListParagraph"/>
+        <w:numPr>
+          <w:ilvl w:val="0"/>
+          <w:numId w:val="1"/>
+        </w:numPr>
+        <w:spacing w:after="60"/>
+      </w:pPr>
+      <w:r>
+        <w:t xml:space="preserve">Unusually transparent, honest, hands-on promoter (publishes closed-door PMS call transcripts); management bench being strengthened; no pledge, no red flags</w:t>
+      </w:r>
+    </w:p>
+    <w:p>
+      <w:pPr>
+        <w:pStyle w:val="ListParagraph"/>
+        <w:numPr>
+          <w:ilvl w:val="0"/>
+          <w:numId w:val="1"/>
+        </w:numPr>
+        <w:spacing w:after="60"/>
+      </w:pPr>
+      <w:r>
+        <w:t xml:space="preserve">Trusted VP user (Marathondreams) accumulating for a year</w:t>
+      </w:r>
+    </w:p>
+    <w:p>
+      <w:pPr>
+        <w:pStyle w:val="ListParagraph"/>
+        <w:numPr>
+          <w:ilvl w:val="0"/>
+          <w:numId w:val="1"/>
+        </w:numPr>
+        <w:spacing w:after="60"/>
+      </w:pPr>
+      <w:r>
+        <w:t xml:space="preserve">5-6 month customer audit cycles are a genuine entry barrier; profit CAGR ~30-37% over 3-5 years off a small base</w:t>
       </w:r>
     </w:p>
     <w:p>
@@ -1258,59 +3171,72 @@
         <w:spacing w:after="60"/>
       </w:pPr>
       <w:r>
-        <w:t xml:space="preserve">Operating leverage is anticipated, not demonstrated - no strong recent quarter yet proving it, and new veg capacity has no disclosed committed clients</w:t>
-      </w:r>
-    </w:p>
-    <w:p>
-      <w:pPr>
-        <w:pStyle w:val="ListParagraph"/>
-        <w:numPr>
-          <w:ilvl w:val="0"/>
-          <w:numId w:val="1"/>
-        </w:numPr>
-        <w:spacing w:after="60"/>
-      </w:pPr>
-      <w:r>
-        <w:t xml:space="preserve">Surprise B2C/D2C 'Unifayre' pivot contradicts prior B2B-only discipline; receivables already doubled YoY and marketing spend rising</w:t>
-      </w:r>
-    </w:p>
-    <w:p>
-      <w:pPr>
-        <w:pStyle w:val="ListParagraph"/>
-        <w:numPr>
-          <w:ilvl w:val="0"/>
-          <w:numId w:val="1"/>
-        </w:numPr>
-        <w:spacing w:after="60"/>
-      </w:pPr>
-      <w:r>
-        <w:t xml:space="preserve">Customer concentration (Jubilant, Subway) limits pricing power; ROCE/ROE modest today</w:t>
-      </w:r>
-    </w:p>
-    <w:p>
-      <w:pPr>
-        <w:pStyle w:val="ListParagraph"/>
-        <w:numPr>
-          <w:ilvl w:val="0"/>
-          <w:numId w:val="1"/>
-        </w:numPr>
-        <w:spacing w:after="60"/>
-      </w:pPr>
-      <w:r>
-        <w:t xml:space="preserve">Trailing P/E ~33 requires the forward earnings ramp to materialise on schedule</w:t>
-      </w:r>
-    </w:p>
-    <w:p>
-      <w:pPr>
-        <w:pStyle w:val="ListParagraph"/>
-        <w:numPr>
-          <w:ilvl w:val="0"/>
-          <w:numId w:val="1"/>
-        </w:numPr>
-        <w:spacing w:after="60"/>
-      </w:pPr>
-      <w:r>
-        <w:t xml:space="preserve">Even on management's own ~5-6x PAT guidance, the implied return is ~3x, not the screen's 10x/100x bar</w:t>
+        <w:t xml:space="preserve">Operating leverage has NOT shown up a full year after capacity completion: FY26 revenue +5.4%, EBITDA margin +19bps only - both far short of prior guidance</w:t>
+      </w:r>
+    </w:p>
+    <w:p>
+      <w:pPr>
+        <w:pStyle w:val="ListParagraph"/>
+        <w:numPr>
+          <w:ilvl w:val="0"/>
+          <w:numId w:val="1"/>
+        </w:numPr>
+        <w:spacing w:after="60"/>
+      </w:pPr>
+      <w:r>
+        <w:t xml:space="preserve">Guidance credibility is weak: FY25's 20% revenue-growth guide was missed, and the FY27-29 guide (Rs 325/450/550cr+, PAT 5-6x) requires a ~96% YoY jump in FY27 alone off a base that just grew 5.4%</w:t>
+      </w:r>
+    </w:p>
+    <w:p>
+      <w:pPr>
+        <w:pStyle w:val="ListParagraph"/>
+        <w:numPr>
+          <w:ilvl w:val="0"/>
+          <w:numId w:val="1"/>
+        </w:numPr>
+        <w:spacing w:after="60"/>
+      </w:pPr>
+      <w:r>
+        <w:t xml:space="preserve">Standalone new veg capacity (outside the Allana JV) has no disclosed anchor B2B clients</w:t>
+      </w:r>
+    </w:p>
+    <w:p>
+      <w:pPr>
+        <w:pStyle w:val="ListParagraph"/>
+        <w:numPr>
+          <w:ilvl w:val="0"/>
+          <w:numId w:val="1"/>
+        </w:numPr>
+        <w:spacing w:after="60"/>
+      </w:pPr>
+      <w:r>
+        <w:t xml:space="preserve">Surprise B2C/D2C 'Unifayre' pivot contradicts prior B2B-only discipline; receivables already doubled YoY, cash conversion cycle lengthened, and marketing spend is rising</w:t>
+      </w:r>
+    </w:p>
+    <w:p>
+      <w:pPr>
+        <w:pStyle w:val="ListParagraph"/>
+        <w:numPr>
+          <w:ilvl w:val="0"/>
+          <w:numId w:val="1"/>
+        </w:numPr>
+        <w:spacing w:after="60"/>
+      </w:pPr>
+      <w:r>
+        <w:t xml:space="preserve">Independent quality read (MoneyWorks4Me) flags a decade of erratic ROCE/ROE (19% FY23 -&gt; 9.5% now) and negative CFO/debt; customer concentration (Jubilant, Subway) limits pricing power</w:t>
+      </w:r>
+    </w:p>
+    <w:p>
+      <w:pPr>
+        <w:pStyle w:val="ListParagraph"/>
+        <w:numPr>
+          <w:ilvl w:val="0"/>
+          <w:numId w:val="1"/>
+        </w:numPr>
+        <w:spacing w:after="60"/>
+      </w:pPr>
+      <w:r>
+        <w:t xml:space="preserve">P/E ~37.9 trailing is rich against demonstrated 5.4% growth / 7.4% margin, not the guided ramp</w:t>
       </w:r>
     </w:p>
     <w:p>
@@ -1331,7 +3257,7 @@
           <w:b/>
           <w:bCs/>
         </w:rPr>
-        <w:t xml:space="preserve">Micro/Small-cap (~Rs 250 Cr)</w:t>
+        <w:t xml:space="preserve">Micro-cap (~Rs 254 Cr)</w:t>
       </w:r>
     </w:p>
     <w:p>
@@ -1367,7 +3293,7 @@
           <w:sz w:val="20"/>
           <w:szCs w:val="20"/>
         </w:rPr>
-        <w:t xml:space="preserve">4-box gate — tailwind: yes · TAM: yes · moat: weak · valuation: weak  (score 3 / 4)</w:t>
+        <w:t xml:space="preserve">4-box gate — tailwind: yes · TAM: yes · moat: weak · valuation: no  (score 2.5 / 4)</w:t>
       </w:r>
     </w:p>
     <w:p>
@@ -1382,7 +3308,7 @@
           <w:sz w:val="20"/>
           <w:szCs w:val="20"/>
         </w:rPr>
-        <w:t xml:space="preserve">Real QSR tailwind and a big operating-leverage TAM from the completed 3x capacity, but the inflection is anticipated not demonstrated, moat is limited by customer concentration, and trailing valuation is rich; score permits a label which judgment defers until FY27 numbers confirm the leverage</w:t>
+        <w:t xml:space="preserve">Real QSR tailwind and a big operating-leverage TAM from the completed 3x capacity; moat limited by customer concentration; valuation moved to 'no' - FY26 delivered just 5.4% growth/7.4% margin against a guided ~96% FY27 growth ramp and a guidance-credibility miss (the FY25 20% growth guide was also missed), so ~38x trailing is not yet supported by demonstrated execution.</w:t>
       </w:r>
     </w:p>
     <w:p>
@@ -1405,98 +3331,85 @@
           <w:sz w:val="24"/>
           <w:szCs w:val="24"/>
         </w:rPr>
-        <w:t xml:space="preserve">A promising small-cap QSR proxy with completed 3x capacity, honest management and a trusted user accumulating - but the operating leverage is not yet in the numbers and the return math is ~3x, not 10x. thesis_fit 'neither', conviction Medium; re-rate if FY27 confirms the leverage.</w:t>
-      </w:r>
-    </w:p>
-    <w:p>
-      <w:pPr>
-        <w:pStyle w:val="ListParagraph"/>
-        <w:numPr>
-          <w:ilvl w:val="0"/>
-          <w:numId w:val="1"/>
-        </w:numPr>
-        <w:spacing w:after="60"/>
-      </w:pPr>
-      <w:r>
-        <w:t xml:space="preserve">four_box: tailwind yes (QSR industry ~20% CAGR, frozen-food penetration, QSR processing outsourcing - real and multi-year), tam yes (16,000 MTPA capacity vs tiny current load = big operating-leverage runway; Middle East export optionality via Allana; only ~Rs 250 Cr market cap), moat weak (5-6 month qualification cycles and sticky QSR relationships are real barriers, but customer concentration and stretching receivables limit pricing power), valuation weak (P/E ~33 trailing is rich; cheap only on an unproven forward ramp) -&gt; score 3.0</w:t>
-      </w:r>
-    </w:p>
-    <w:p>
-      <w:pPr>
-        <w:pStyle w:val="ListParagraph"/>
-        <w:numPr>
-          <w:ilvl w:val="0"/>
-          <w:numId w:val="1"/>
-        </w:numPr>
-        <w:spacing w:after="60"/>
-      </w:pPr>
-      <w:r>
-        <w:t xml:space="preserve">Score 3.0 permits a return-magnitude label, but the 'trailing average vs live inflection' rule needs a demonstrated strong recent quarter plus catalyst - here the catalyst (3x capacity live) is in place but the operating-leverage inflection is still anticipated ('to play out in FY27/28'), not shown -&gt; thesis_fit 'neither' for now, conviction Medium (Marathondreams accumulating, capacity in place, honest promoter)</w:t>
-      </w:r>
-    </w:p>
-    <w:p>
-      <w:pPr>
-        <w:pStyle w:val="ListParagraph"/>
-        <w:numPr>
-          <w:ilvl w:val="0"/>
-          <w:numId w:val="1"/>
-        </w:numPr>
-        <w:spacing w:after="60"/>
-      </w:pPr>
-      <w:r>
-        <w:t xml:space="preserve">If FY27 quarters demonstrate the operating leverage (utilisation ramp + margin expansion), this moves to '10x-in-2-3-years' at Low-Medium with an 'unconfirmed' caveat on the next re-check</w:t>
-      </w:r>
-    </w:p>
-    <w:p>
-      <w:pPr>
-        <w:pStyle w:val="ListParagraph"/>
-        <w:numPr>
-          <w:ilvl w:val="0"/>
-          <w:numId w:val="1"/>
-        </w:numPr>
-        <w:spacing w:after="60"/>
-      </w:pPr>
-      <w:r>
-        <w:t xml:space="preserve">No live-theme keyword match; it is a consumption/QSR proxy. value_chain position is reasonably clear (B2B processing layer feeding QSR brands) so a value_chain block is written</w:t>
-      </w:r>
-    </w:p>
-    <w:p>
-      <w:pPr>
-        <w:pStyle w:val="ListParagraph"/>
-        <w:numPr>
-          <w:ilvl w:val="0"/>
-          <w:numId w:val="1"/>
-        </w:numPr>
-        <w:spacing w:after="60"/>
-      </w:pPr>
-      <w:r>
-        <w:t xml:space="preserve">No red flag - governance is a positive (publishes analyst-call transcripts)</w:t>
-      </w:r>
-    </w:p>
-    <w:p>
-      <w:pPr>
-        <w:pStyle w:val="ListParagraph"/>
-        <w:numPr>
-          <w:ilvl w:val="0"/>
-          <w:numId w:val="1"/>
-        </w:numPr>
-        <w:spacing w:after="60"/>
-      </w:pPr>
-      <w:r>
-        <w:t xml:space="preserve">revisit_after_30d: false (conviction Medium, not Medium-High, and thesis_fit 'neither')</w:t>
-      </w:r>
-    </w:p>
-    <w:p>
-      <w:pPr>
-        <w:pStyle w:val="ListParagraph"/>
-        <w:numPr>
-          <w:ilvl w:val="0"/>
-          <w:numId w:val="1"/>
-        </w:numPr>
-        <w:spacing w:after="60"/>
-      </w:pPr>
-      <w:r>
-        <w:t xml:space="preserve">Re-check trigger: Q2/Q3 FY27 capacity utilisation and EBITDA margin trajectory; whether the new veg plant secures disclosed B2B clients; Unifayre B2C burn and receivables trend</w:t>
+        <w:t xml:space="preserve">Pass-1 deep dive: capacity is real and the Allana JV has genuine committed offtake, but a full year after the 3x expansion completed, the operating-leverage inflection has NOT shown up (FY26 +5.4% revenue, +19bps margin) and management's own FY27-29 guidance ramp follows a missed FY25 guide - thesis_fit stays 'neither', conviction moves down to Low-Medium pending FY27 quarters that actually demonstrate the ramp.</w:t>
+      </w:r>
+    </w:p>
+    <w:p>
+      <w:pPr>
+        <w:pStyle w:val="ListParagraph"/>
+        <w:numPr>
+          <w:ilvl w:val="0"/>
+          <w:numId w:val="1"/>
+        </w:numPr>
+        <w:spacing w:after="60"/>
+      </w:pPr>
+      <w:r>
+        <w:t xml:space="preserve">four_box: tailwind yes (QSR industry ~20% CAGR, frozen-food penetration, QSR processing outsourcing - real and multi-year), tam yes (16,000 MTPA capacity vs tiny current load = big operating-leverage runway; only ~Rs 254 Cr market cap), moat weak (5-6 month qualification cycles are a real barrier, but customer concentration and stretching receivables limit pricing power), valuation downgraded to no (P/E ~37.9 against FY26's actual 5.4% growth/7.4% margin and a guidance-credibility miss is not supported by demonstrated execution) -&gt; score 2.5</w:t>
+      </w:r>
+    </w:p>
+    <w:p>
+      <w:pPr>
+        <w:pStyle w:val="ListParagraph"/>
+        <w:numPr>
+          <w:ilvl w:val="0"/>
+          <w:numId w:val="1"/>
+        </w:numPr>
+        <w:spacing w:after="60"/>
+      </w:pPr>
+      <w:r>
+        <w:t xml:space="preserve">Score 2.5 falls in the 2.0-2.5 band, which defaults to thesis_fit 'neither' unless a written exception applies (valuation=yes, un-ignorable growth, or the large-cap named-inflection carve-out) - none apply here since growth was only 5.4% and valuation itself moved to 'no' -&gt; 'neither' stands without needing an override flag</w:t>
+      </w:r>
+    </w:p>
+    <w:p>
+      <w:pPr>
+        <w:pStyle w:val="ListParagraph"/>
+        <w:numPr>
+          <w:ilvl w:val="0"/>
+          <w:numId w:val="1"/>
+        </w:numPr>
+        <w:spacing w:after="60"/>
+      </w:pPr>
+      <w:r>
+        <w:t xml:space="preserve">Conviction moved from Medium to Low-Medium: the pass-1 primary-document read found the core operating-leverage thesis has not progressed in a year (FY25 guide missed, FY26 delivered far below the new FY27-29 guide), which is a real negative update even though governance remains clean and the Allana JV's committed-offtake structure is a genuine (if partial) positive</w:t>
+      </w:r>
+    </w:p>
+    <w:p>
+      <w:pPr>
+        <w:pStyle w:val="ListParagraph"/>
+        <w:numPr>
+          <w:ilvl w:val="0"/>
+          <w:numId w:val="1"/>
+        </w:numPr>
+        <w:spacing w:after="60"/>
+      </w:pPr>
+      <w:r>
+        <w:t xml:space="preserve">No red flag - governance is a positive (publishes analyst-call transcripts, 0% pledge, no auditor issues)</w:t>
+      </w:r>
+    </w:p>
+    <w:p>
+      <w:pPr>
+        <w:pStyle w:val="ListParagraph"/>
+        <w:numPr>
+          <w:ilvl w:val="0"/>
+          <w:numId w:val="1"/>
+        </w:numPr>
+        <w:spacing w:after="60"/>
+      </w:pPr>
+      <w:r>
+        <w:t xml:space="preserve">revisit_after_30d unchanged by this pass (script-owned field, not touched)</w:t>
+      </w:r>
+    </w:p>
+    <w:p>
+      <w:pPr>
+        <w:pStyle w:val="ListParagraph"/>
+        <w:numPr>
+          <w:ilvl w:val="0"/>
+          <w:numId w:val="1"/>
+        </w:numPr>
+        <w:spacing w:after="60"/>
+      </w:pPr>
+      <w:r>
+        <w:t xml:space="preserve">Re-check trigger: Q2/Q3 FY27 capacity utilisation and EBITDA margin trajectory against the Rs 325cr/12-13% margin guide; whether the new standalone veg plant secures disclosed B2B clients; Unifayre B2C burn, receivables and cash-conversion-cycle trend</w:t>
       </w:r>
     </w:p>
     <w:p>

</xml_diff>